<commit_message>
Course site: syllabus, schedule and Lecture 1 courseware
</commit_message>
<xml_diff>
--- a/files/Syllabus-Big-Data-Analytics-2026.docx
+++ b/files/Syllabus-Big-Data-Analytics-2026.docx
@@ -238,7 +238,7 @@
         <w:rPr>
           <w:noProof/>
         </w:rPr>
-        <w:instrText>PAGEREF _Toc240559660 \h</w:instrText>
+        <w:instrText>PAGEREF _Toc240561315 \h</w:instrText>
       </w:r>
       <w:r>
         <w:rPr>
@@ -325,7 +325,7 @@
         <w:rPr>
           <w:noProof/>
         </w:rPr>
-        <w:instrText>PAGEREF _Toc240559661 \h</w:instrText>
+        <w:instrText>PAGEREF _Toc240561316 \h</w:instrText>
       </w:r>
       <w:r>
         <w:rPr>
@@ -412,7 +412,7 @@
         <w:rPr>
           <w:noProof/>
         </w:rPr>
-        <w:instrText>PAGEREF _Toc240559662 \h</w:instrText>
+        <w:instrText>PAGEREF _Toc240561317 \h</w:instrText>
       </w:r>
       <w:r>
         <w:rPr>
@@ -534,7 +534,7 @@
         <w:rPr>
           <w:noProof/>
         </w:rPr>
-        <w:instrText>PAGEREF _Toc240559663 \h</w:instrText>
+        <w:instrText>PAGEREF _Toc240561318 \h</w:instrText>
       </w:r>
       <w:r>
         <w:rPr>
@@ -621,7 +621,7 @@
         <w:rPr>
           <w:noProof/>
         </w:rPr>
-        <w:instrText>PAGEREF _Toc240559664 \h</w:instrText>
+        <w:instrText>PAGEREF _Toc240561319 \h</w:instrText>
       </w:r>
       <w:r>
         <w:rPr>
@@ -736,7 +736,7 @@
         <w:rPr>
           <w:noProof/>
         </w:rPr>
-        <w:instrText>PAGEREF _Toc240559665 \h</w:instrText>
+        <w:instrText>PAGEREF _Toc240561320 \h</w:instrText>
       </w:r>
       <w:r>
         <w:rPr>
@@ -830,7 +830,7 @@
         <w:rPr>
           <w:noProof/>
         </w:rPr>
-        <w:instrText>PAGEREF _Toc240559666 \h</w:instrText>
+        <w:instrText>PAGEREF _Toc240561321 \h</w:instrText>
       </w:r>
       <w:r>
         <w:rPr>
@@ -931,7 +931,7 @@
         <w:rPr>
           <w:noProof/>
         </w:rPr>
-        <w:instrText>PAGEREF _Toc240559667 \h</w:instrText>
+        <w:instrText>PAGEREF _Toc240561322 \h</w:instrText>
       </w:r>
       <w:r>
         <w:rPr>
@@ -1025,7 +1025,7 @@
         <w:rPr>
           <w:noProof/>
         </w:rPr>
-        <w:instrText>PAGEREF _Toc240559668 \h</w:instrText>
+        <w:instrText>PAGEREF _Toc240561323 \h</w:instrText>
       </w:r>
       <w:r>
         <w:rPr>
@@ -1119,7 +1119,7 @@
         <w:rPr>
           <w:noProof/>
         </w:rPr>
-        <w:instrText>PAGEREF _Toc240559669 \h</w:instrText>
+        <w:instrText>PAGEREF _Toc240561324 \h</w:instrText>
       </w:r>
       <w:r>
         <w:rPr>
@@ -1213,7 +1213,7 @@
         <w:rPr>
           <w:noProof/>
         </w:rPr>
-        <w:instrText>PAGEREF _Toc240559670 \h</w:instrText>
+        <w:instrText>PAGEREF _Toc240561325 \h</w:instrText>
       </w:r>
       <w:r>
         <w:rPr>
@@ -1307,7 +1307,7 @@
         <w:rPr>
           <w:noProof/>
         </w:rPr>
-        <w:instrText>PAGEREF _Toc240559671 \h</w:instrText>
+        <w:instrText>PAGEREF _Toc240561326 \h</w:instrText>
       </w:r>
       <w:r>
         <w:rPr>
@@ -1401,7 +1401,7 @@
         <w:rPr>
           <w:noProof/>
         </w:rPr>
-        <w:instrText>PAGEREF _Toc240559672 \h</w:instrText>
+        <w:instrText>PAGEREF _Toc240561327 \h</w:instrText>
       </w:r>
       <w:r>
         <w:rPr>
@@ -1495,7 +1495,7 @@
         <w:rPr>
           <w:noProof/>
         </w:rPr>
-        <w:instrText>PAGEREF _Toc240559673 \h</w:instrText>
+        <w:instrText>PAGEREF _Toc240561328 \h</w:instrText>
       </w:r>
       <w:r>
         <w:rPr>
@@ -1589,7 +1589,7 @@
         <w:rPr>
           <w:noProof/>
         </w:rPr>
-        <w:instrText>PAGEREF _Toc240559674 \h</w:instrText>
+        <w:instrText>PAGEREF _Toc240561329 \h</w:instrText>
       </w:r>
       <w:r>
         <w:rPr>
@@ -1683,7 +1683,7 @@
         <w:rPr>
           <w:noProof/>
         </w:rPr>
-        <w:instrText>PAGEREF _Toc240559675 \h</w:instrText>
+        <w:instrText>PAGEREF _Toc240561330 \h</w:instrText>
       </w:r>
       <w:r>
         <w:rPr>
@@ -1777,7 +1777,7 @@
         <w:rPr>
           <w:noProof/>
         </w:rPr>
-        <w:instrText>PAGEREF _Toc240559676 \h</w:instrText>
+        <w:instrText>PAGEREF _Toc240561331 \h</w:instrText>
       </w:r>
       <w:r>
         <w:rPr>
@@ -1871,7 +1871,7 @@
         <w:rPr>
           <w:noProof/>
         </w:rPr>
-        <w:instrText>PAGEREF _Toc240559677 \h</w:instrText>
+        <w:instrText>PAGEREF _Toc240561332 \h</w:instrText>
       </w:r>
       <w:r>
         <w:rPr>
@@ -1965,7 +1965,7 @@
         <w:rPr>
           <w:noProof/>
         </w:rPr>
-        <w:instrText>PAGEREF _Toc240559678 \h</w:instrText>
+        <w:instrText>PAGEREF _Toc240561333 \h</w:instrText>
       </w:r>
       <w:r>
         <w:rPr>
@@ -2059,7 +2059,7 @@
         <w:rPr>
           <w:noProof/>
         </w:rPr>
-        <w:instrText>PAGEREF _Toc240559679 \h</w:instrText>
+        <w:instrText>PAGEREF _Toc240561334 \h</w:instrText>
       </w:r>
       <w:r>
         <w:rPr>
@@ -2146,7 +2146,7 @@
         <w:rPr>
           <w:noProof/>
         </w:rPr>
-        <w:instrText>PAGEREF _Toc240559680 \h</w:instrText>
+        <w:instrText>PAGEREF _Toc240561335 \h</w:instrText>
       </w:r>
       <w:r>
         <w:rPr>
@@ -2213,7 +2213,7 @@
           <w:rFonts w:hint="eastAsia"/>
           <w:noProof/>
         </w:rPr>
-        <w:t>（每项满分</w:t>
+        <w:t>（项目满分</w:t>
       </w:r>
       <w:r>
         <w:rPr>
@@ -2254,7 +2254,7 @@
         <w:rPr>
           <w:noProof/>
         </w:rPr>
-        <w:instrText>PAGEREF _Toc240559681 \h</w:instrText>
+        <w:instrText>PAGEREF _Toc240561336 \h</w:instrText>
       </w:r>
       <w:r>
         <w:rPr>
@@ -2341,7 +2341,7 @@
         <w:rPr>
           <w:noProof/>
         </w:rPr>
-        <w:instrText>PAGEREF _Toc240559682 \h</w:instrText>
+        <w:instrText>PAGEREF _Toc240561337 \h</w:instrText>
       </w:r>
       <w:r>
         <w:rPr>
@@ -2442,7 +2442,7 @@
         <w:rPr>
           <w:noProof/>
         </w:rPr>
-        <w:instrText>PAGEREF _Toc240559683 \h</w:instrText>
+        <w:instrText>PAGEREF _Toc240561338 \h</w:instrText>
       </w:r>
       <w:r>
         <w:rPr>
@@ -2543,7 +2543,7 @@
         <w:rPr>
           <w:noProof/>
         </w:rPr>
-        <w:instrText>PAGEREF _Toc240559684 \h</w:instrText>
+        <w:instrText>PAGEREF _Toc240561339 \h</w:instrText>
       </w:r>
       <w:r>
         <w:rPr>
@@ -2644,7 +2644,7 @@
         <w:rPr>
           <w:noProof/>
         </w:rPr>
-        <w:instrText>PAGEREF _Toc240559685 \h</w:instrText>
+        <w:instrText>PAGEREF _Toc240561340 \h</w:instrText>
       </w:r>
       <w:r>
         <w:rPr>
@@ -2731,7 +2731,7 @@
         <w:rPr>
           <w:noProof/>
         </w:rPr>
-        <w:instrText>PAGEREF _Toc240559686 \h</w:instrText>
+        <w:instrText>PAGEREF _Toc240561341 \h</w:instrText>
       </w:r>
       <w:r>
         <w:rPr>
@@ -2819,7 +2819,7 @@
         <w:rPr>
           <w:noProof/>
         </w:rPr>
-        <w:instrText>PAGEREF _Toc240559687 \h</w:instrText>
+        <w:instrText>PAGEREF _Toc240561342 \h</w:instrText>
       </w:r>
       <w:r>
         <w:rPr>
@@ -2906,7 +2906,7 @@
         <w:rPr>
           <w:noProof/>
         </w:rPr>
-        <w:instrText>PAGEREF _Toc240559688 \h</w:instrText>
+        <w:instrText>PAGEREF _Toc240561343 \h</w:instrText>
       </w:r>
       <w:r>
         <w:rPr>
@@ -2993,7 +2993,7 @@
         <w:rPr>
           <w:noProof/>
         </w:rPr>
-        <w:instrText>PAGEREF _Toc240559689 \h</w:instrText>
+        <w:instrText>PAGEREF _Toc240561344 \h</w:instrText>
       </w:r>
       <w:r>
         <w:rPr>
@@ -3080,7 +3080,7 @@
         <w:rPr>
           <w:noProof/>
         </w:rPr>
-        <w:instrText>PAGEREF _Toc240559690 \h</w:instrText>
+        <w:instrText>PAGEREF _Toc240561345 \h</w:instrText>
       </w:r>
       <w:r>
         <w:rPr>
@@ -3107,7 +3107,7 @@
           <w:rFonts w:hint="eastAsia"/>
           <w:noProof/>
         </w:rPr>
-        <w:t>10</w:t>
+        <w:t>11</w:t>
       </w:r>
       <w:r>
         <w:rPr>
@@ -3167,7 +3167,7 @@
         <w:rPr>
           <w:noProof/>
         </w:rPr>
-        <w:instrText>PAGEREF _Toc240559691 \h</w:instrText>
+        <w:instrText>PAGEREF _Toc240561346 \h</w:instrText>
       </w:r>
       <w:r>
         <w:rPr>
@@ -3268,7 +3268,7 @@
         <w:rPr>
           <w:noProof/>
         </w:rPr>
-        <w:instrText>PAGEREF _Toc240559692 \h</w:instrText>
+        <w:instrText>PAGEREF _Toc240561347 \h</w:instrText>
       </w:r>
       <w:r>
         <w:rPr>
@@ -3318,7 +3318,7 @@
         </w:rPr>
         <w:fldChar w:fldCharType="end"/>
       </w:r>
-      <w:bookmarkStart w:id="0" w:name="_Toc240559660"/>
+      <w:bookmarkStart w:id="0" w:name="_Toc240561315"/>
       <w:r>
         <w:rPr>
           <w:rFonts w:hint="eastAsia"/>
@@ -4426,14 +4426,28 @@
                 <w:rFonts w:hint="eastAsia"/>
                 <w:sz w:val="19"/>
               </w:rPr>
-              <w:t xml:space="preserve"> 8 </w:t>
-            </w:r>
-            <w:r>
-              <w:rPr>
-                <w:rFonts w:hint="eastAsia"/>
-                <w:sz w:val="19"/>
-              </w:rPr>
-              <w:t>节声明使用）</w:t>
+              <w:t xml:space="preserve"> 10 </w:t>
+            </w:r>
+            <w:r>
+              <w:rPr>
+                <w:rFonts w:hint="eastAsia"/>
+                <w:sz w:val="19"/>
+              </w:rPr>
+              <w:t>节课程政策与附录《</w:t>
+            </w:r>
+            <w:r>
+              <w:rPr>
+                <w:rFonts w:hint="eastAsia"/>
+                <w:sz w:val="19"/>
+              </w:rPr>
+              <w:t xml:space="preserve">AI </w:t>
+            </w:r>
+            <w:r>
+              <w:rPr>
+                <w:rFonts w:hint="eastAsia"/>
+                <w:sz w:val="19"/>
+              </w:rPr>
+              <w:t>使用声明》执行）</w:t>
             </w:r>
           </w:p>
         </w:tc>
@@ -4502,7 +4516,7 @@
                 <w:rFonts w:hint="eastAsia"/>
                 <w:sz w:val="19"/>
               </w:rPr>
-              <w:t>课堂展示</w:t>
+              <w:t>出勤</w:t>
             </w:r>
             <w:r>
               <w:rPr>
@@ -4530,7 +4544,21 @@
                 <w:rFonts w:hint="eastAsia"/>
                 <w:sz w:val="19"/>
               </w:rPr>
-              <w:t>（</w:t>
+              <w:t>：从四个研究项目中任选</w:t>
+            </w:r>
+            <w:r>
+              <w:rPr>
+                <w:rFonts w:hint="eastAsia"/>
+                <w:sz w:val="19"/>
+              </w:rPr>
+              <w:t xml:space="preserve"> 1 </w:t>
+            </w:r>
+            <w:r>
+              <w:rPr>
+                <w:rFonts w:hint="eastAsia"/>
+                <w:sz w:val="19"/>
+              </w:rPr>
+              <w:t>项完成（</w:t>
             </w:r>
             <w:r>
               <w:rPr>
@@ -4544,35 +4572,35 @@
                 <w:rFonts w:hint="eastAsia"/>
                 <w:sz w:val="19"/>
               </w:rPr>
-              <w:t>个研究项目选做</w:t>
-            </w:r>
-            <w:r>
-              <w:rPr>
-                <w:rFonts w:hint="eastAsia"/>
-                <w:sz w:val="19"/>
-              </w:rPr>
-              <w:t xml:space="preserve"> 3 </w:t>
-            </w:r>
-            <w:r>
-              <w:rPr>
-                <w:rFonts w:hint="eastAsia"/>
-                <w:sz w:val="19"/>
-              </w:rPr>
-              <w:t>个，每项</w:t>
-            </w:r>
-            <w:r>
-              <w:rPr>
-                <w:rFonts w:hint="eastAsia"/>
-                <w:sz w:val="19"/>
-              </w:rPr>
-              <w:t xml:space="preserve"> 30%</w:t>
-            </w:r>
-            <w:r>
-              <w:rPr>
-                <w:rFonts w:hint="eastAsia"/>
-                <w:sz w:val="19"/>
-              </w:rPr>
-              <w:t>；组队不超过</w:t>
+              <w:t>选</w:t>
+            </w:r>
+            <w:r>
+              <w:rPr>
+                <w:rFonts w:hint="eastAsia"/>
+                <w:sz w:val="19"/>
+              </w:rPr>
+              <w:t xml:space="preserve"> 1</w:t>
+            </w:r>
+            <w:r>
+              <w:rPr>
+                <w:rFonts w:hint="eastAsia"/>
+                <w:sz w:val="19"/>
+              </w:rPr>
+              <w:t>）；项目更加开放并鼓励结合</w:t>
+            </w:r>
+            <w:r>
+              <w:rPr>
+                <w:rFonts w:hint="eastAsia"/>
+                <w:sz w:val="19"/>
+              </w:rPr>
+              <w:t xml:space="preserve"> AI </w:t>
+            </w:r>
+            <w:r>
+              <w:rPr>
+                <w:rFonts w:hint="eastAsia"/>
+                <w:sz w:val="19"/>
+              </w:rPr>
+              <w:t>工具；组队不超过</w:t>
             </w:r>
             <w:r>
               <w:rPr>
@@ -4586,7 +4614,7 @@
                 <w:rFonts w:hint="eastAsia"/>
                 <w:sz w:val="19"/>
               </w:rPr>
-              <w:t>人）</w:t>
+              <w:t>人</w:t>
             </w:r>
           </w:p>
         </w:tc>
@@ -4599,7 +4627,7 @@
           <w:rFonts w:hint="eastAsia"/>
         </w:rPr>
       </w:pPr>
-      <w:bookmarkStart w:id="1" w:name="_Toc240559661"/>
+      <w:bookmarkStart w:id="1" w:name="_Toc240561316"/>
       <w:r>
         <w:rPr>
           <w:rFonts w:hint="eastAsia"/>
@@ -4774,7 +4802,7 @@
           <w:rFonts w:hint="eastAsia"/>
         </w:rPr>
       </w:pPr>
-      <w:bookmarkStart w:id="2" w:name="_Toc240559662"/>
+      <w:bookmarkStart w:id="2" w:name="_Toc240561317"/>
       <w:r>
         <w:rPr>
           <w:rFonts w:hint="eastAsia"/>
@@ -5050,7 +5078,7 @@
           <w:rFonts w:hint="eastAsia"/>
         </w:rPr>
       </w:pPr>
-      <w:bookmarkStart w:id="3" w:name="_Toc240559663"/>
+      <w:bookmarkStart w:id="3" w:name="_Toc240561318"/>
       <w:r>
         <w:rPr>
           <w:rFonts w:hint="eastAsia"/>
@@ -6736,21 +6764,35 @@
                 <w:rFonts w:hint="eastAsia"/>
                 <w:sz w:val="19"/>
               </w:rPr>
-              <w:t>；作业</w:t>
-            </w:r>
-            <w:r>
-              <w:rPr>
-                <w:rFonts w:hint="eastAsia"/>
-                <w:sz w:val="19"/>
-              </w:rPr>
-              <w:t xml:space="preserve"> 2 </w:t>
-            </w:r>
-            <w:r>
-              <w:rPr>
-                <w:rFonts w:hint="eastAsia"/>
-                <w:sz w:val="19"/>
-              </w:rPr>
-              <w:t>布置</w:t>
+              <w:t>；项目选题说明（一页：问题</w:t>
+            </w:r>
+            <w:r>
+              <w:rPr>
+                <w:rFonts w:hint="eastAsia"/>
+                <w:sz w:val="19"/>
+              </w:rPr>
+              <w:t>/</w:t>
+            </w:r>
+            <w:r>
+              <w:rPr>
+                <w:rFonts w:hint="eastAsia"/>
+                <w:sz w:val="19"/>
+              </w:rPr>
+              <w:t>数据</w:t>
+            </w:r>
+            <w:r>
+              <w:rPr>
+                <w:rFonts w:hint="eastAsia"/>
+                <w:sz w:val="19"/>
+              </w:rPr>
+              <w:t>/</w:t>
+            </w:r>
+            <w:r>
+              <w:rPr>
+                <w:rFonts w:hint="eastAsia"/>
+                <w:sz w:val="19"/>
+              </w:rPr>
+              <w:t>方法）</w:t>
             </w:r>
           </w:p>
         </w:tc>
@@ -7587,21 +7629,7 @@
                 <w:rFonts w:hint="eastAsia"/>
                 <w:sz w:val="19"/>
               </w:rPr>
-              <w:t>；作业</w:t>
-            </w:r>
-            <w:r>
-              <w:rPr>
-                <w:rFonts w:hint="eastAsia"/>
-                <w:sz w:val="19"/>
-              </w:rPr>
-              <w:t xml:space="preserve"> 2 </w:t>
-            </w:r>
-            <w:r>
-              <w:rPr>
-                <w:rFonts w:hint="eastAsia"/>
-                <w:sz w:val="19"/>
-              </w:rPr>
-              <w:t>提交</w:t>
+              <w:t>；项目数据与探索阶段检查</w:t>
             </w:r>
           </w:p>
         </w:tc>
@@ -8251,21 +8279,21 @@
                 <w:rFonts w:hint="eastAsia"/>
                 <w:sz w:val="19"/>
               </w:rPr>
-              <w:t>文档；作业</w:t>
-            </w:r>
-            <w:r>
-              <w:rPr>
-                <w:rFonts w:hint="eastAsia"/>
-                <w:sz w:val="19"/>
-              </w:rPr>
-              <w:t xml:space="preserve"> 3 </w:t>
-            </w:r>
-            <w:r>
-              <w:rPr>
-                <w:rFonts w:hint="eastAsia"/>
-                <w:sz w:val="19"/>
-              </w:rPr>
-              <w:t>布置</w:t>
+              <w:t>文档；项目方法与</w:t>
+            </w:r>
+            <w:r>
+              <w:rPr>
+                <w:rFonts w:hint="eastAsia"/>
+                <w:sz w:val="19"/>
+              </w:rPr>
+              <w:t xml:space="preserve"> AI </w:t>
+            </w:r>
+            <w:r>
+              <w:rPr>
+                <w:rFonts w:hint="eastAsia"/>
+                <w:sz w:val="19"/>
+              </w:rPr>
+              <w:t>工具使用说明</w:t>
             </w:r>
           </w:p>
         </w:tc>
@@ -8584,21 +8612,21 @@
                 <w:rFonts w:hint="eastAsia"/>
                 <w:sz w:val="19"/>
               </w:rPr>
-              <w:t>》；作业</w:t>
-            </w:r>
-            <w:r>
-              <w:rPr>
-                <w:rFonts w:hint="eastAsia"/>
-                <w:sz w:val="19"/>
-              </w:rPr>
-              <w:t xml:space="preserve"> 3 </w:t>
-            </w:r>
-            <w:r>
-              <w:rPr>
-                <w:rFonts w:hint="eastAsia"/>
-                <w:sz w:val="19"/>
-              </w:rPr>
-              <w:t>提交</w:t>
+              <w:t>》；项目初稿</w:t>
+            </w:r>
+            <w:r>
+              <w:rPr>
+                <w:rFonts w:hint="eastAsia"/>
+                <w:sz w:val="19"/>
+              </w:rPr>
+              <w:t xml:space="preserve"> / </w:t>
+            </w:r>
+            <w:r>
+              <w:rPr>
+                <w:rFonts w:hint="eastAsia"/>
+                <w:sz w:val="19"/>
+              </w:rPr>
+              <w:t>中期汇报</w:t>
             </w:r>
           </w:p>
         </w:tc>
@@ -9295,7 +9323,7 @@
                 <w:rFonts w:hint="eastAsia"/>
                 <w:sz w:val="19"/>
               </w:rPr>
-              <w:t>；项目报告与展示</w:t>
+              <w:t>；项目报告提交与展示</w:t>
             </w:r>
           </w:p>
         </w:tc>
@@ -9308,7 +9336,7 @@
           <w:rFonts w:hint="eastAsia"/>
         </w:rPr>
       </w:pPr>
-      <w:bookmarkStart w:id="4" w:name="_Toc240559664"/>
+      <w:bookmarkStart w:id="4" w:name="_Toc240561319"/>
       <w:r>
         <w:rPr>
           <w:rFonts w:hint="eastAsia"/>
@@ -9330,7 +9358,7 @@
           <w:rFonts w:hint="eastAsia"/>
         </w:rPr>
       </w:pPr>
-      <w:bookmarkStart w:id="5" w:name="_Toc240559665"/>
+      <w:bookmarkStart w:id="5" w:name="_Toc240561320"/>
       <w:r>
         <w:rPr>
           <w:rFonts w:hint="eastAsia"/>
@@ -9680,7 +9708,7 @@
           <w:rFonts w:hint="eastAsia"/>
         </w:rPr>
       </w:pPr>
-      <w:bookmarkStart w:id="6" w:name="_Toc240559666"/>
+      <w:bookmarkStart w:id="6" w:name="_Toc240561321"/>
       <w:r>
         <w:rPr>
           <w:rFonts w:hint="eastAsia"/>
@@ -9969,7 +9997,7 @@
           <w:rFonts w:hint="eastAsia"/>
         </w:rPr>
       </w:pPr>
-      <w:bookmarkStart w:id="7" w:name="_Toc240559667"/>
+      <w:bookmarkStart w:id="7" w:name="_Toc240561322"/>
       <w:r>
         <w:rPr>
           <w:rFonts w:hint="eastAsia"/>
@@ -10228,7 +10256,7 @@
           <w:rFonts w:hint="eastAsia"/>
         </w:rPr>
       </w:pPr>
-      <w:bookmarkStart w:id="8" w:name="_Toc240559668"/>
+      <w:bookmarkStart w:id="8" w:name="_Toc240561323"/>
       <w:r>
         <w:rPr>
           <w:rFonts w:hint="eastAsia"/>
@@ -10481,7 +10509,7 @@
           <w:rFonts w:hint="eastAsia"/>
         </w:rPr>
       </w:pPr>
-      <w:bookmarkStart w:id="9" w:name="_Toc240559669"/>
+      <w:bookmarkStart w:id="9" w:name="_Toc240561324"/>
       <w:r>
         <w:rPr>
           <w:rFonts w:hint="eastAsia"/>
@@ -10698,7 +10726,7 @@
           <w:rFonts w:hint="eastAsia"/>
         </w:rPr>
       </w:pPr>
-      <w:bookmarkStart w:id="10" w:name="_Toc240559670"/>
+      <w:bookmarkStart w:id="10" w:name="_Toc240561325"/>
       <w:r>
         <w:rPr>
           <w:rFonts w:hint="eastAsia"/>
@@ -10918,7 +10946,7 @@
           <w:rFonts w:hint="eastAsia"/>
         </w:rPr>
       </w:pPr>
-      <w:bookmarkStart w:id="11" w:name="_Toc240559671"/>
+      <w:bookmarkStart w:id="11" w:name="_Toc240561326"/>
       <w:r>
         <w:rPr>
           <w:rFonts w:hint="eastAsia"/>
@@ -11232,7 +11260,7 @@
           <w:rFonts w:hint="eastAsia"/>
         </w:rPr>
       </w:pPr>
-      <w:bookmarkStart w:id="12" w:name="_Toc240559672"/>
+      <w:bookmarkStart w:id="12" w:name="_Toc240561327"/>
       <w:r>
         <w:rPr>
           <w:rFonts w:hint="eastAsia"/>
@@ -11509,7 +11537,7 @@
           <w:rFonts w:hint="eastAsia"/>
         </w:rPr>
       </w:pPr>
-      <w:bookmarkStart w:id="13" w:name="_Toc240559673"/>
+      <w:bookmarkStart w:id="13" w:name="_Toc240561328"/>
       <w:r>
         <w:rPr>
           <w:rFonts w:hint="eastAsia"/>
@@ -11774,7 +11802,7 @@
           <w:rFonts w:hint="eastAsia"/>
         </w:rPr>
       </w:pPr>
-      <w:bookmarkStart w:id="14" w:name="_Toc240559674"/>
+      <w:bookmarkStart w:id="14" w:name="_Toc240561329"/>
       <w:r>
         <w:rPr>
           <w:rFonts w:hint="eastAsia"/>
@@ -12123,7 +12151,7 @@
           <w:rFonts w:hint="eastAsia"/>
         </w:rPr>
       </w:pPr>
-      <w:bookmarkStart w:id="15" w:name="_Toc240559675"/>
+      <w:bookmarkStart w:id="15" w:name="_Toc240561330"/>
       <w:r>
         <w:rPr>
           <w:rFonts w:hint="eastAsia"/>
@@ -12484,7 +12512,7 @@
           <w:rFonts w:hint="eastAsia"/>
         </w:rPr>
       </w:pPr>
-      <w:bookmarkStart w:id="16" w:name="_Toc240559676"/>
+      <w:bookmarkStart w:id="16" w:name="_Toc240561331"/>
       <w:r>
         <w:rPr>
           <w:rFonts w:hint="eastAsia"/>
@@ -12774,7 +12802,7 @@
           <w:rFonts w:hint="eastAsia"/>
         </w:rPr>
       </w:pPr>
-      <w:bookmarkStart w:id="17" w:name="_Toc240559677"/>
+      <w:bookmarkStart w:id="17" w:name="_Toc240561332"/>
       <w:r>
         <w:rPr>
           <w:rFonts w:hint="eastAsia"/>
@@ -13099,7 +13127,7 @@
           <w:rFonts w:hint="eastAsia"/>
         </w:rPr>
       </w:pPr>
-      <w:bookmarkStart w:id="18" w:name="_Toc240559678"/>
+      <w:bookmarkStart w:id="18" w:name="_Toc240561333"/>
       <w:r>
         <w:rPr>
           <w:rFonts w:hint="eastAsia"/>
@@ -13388,7 +13416,7 @@
           <w:rFonts w:hint="eastAsia"/>
         </w:rPr>
       </w:pPr>
-      <w:bookmarkStart w:id="19" w:name="_Toc240559679"/>
+      <w:bookmarkStart w:id="19" w:name="_Toc240561334"/>
       <w:r>
         <w:rPr>
           <w:rFonts w:hint="eastAsia"/>
@@ -13665,7 +13693,7 @@
           <w:rFonts w:hint="eastAsia"/>
         </w:rPr>
       </w:pPr>
-      <w:bookmarkStart w:id="20" w:name="_Toc240559680"/>
+      <w:bookmarkStart w:id="20" w:name="_Toc240561335"/>
       <w:r>
         <w:rPr>
           <w:rFonts w:hint="eastAsia"/>
@@ -13703,7 +13731,7 @@
         <w:rPr>
           <w:rFonts w:hint="eastAsia"/>
         </w:rPr>
-        <w:t>课堂展示</w:t>
+        <w:t>出勤</w:t>
       </w:r>
       <w:r>
         <w:rPr>
@@ -13745,25 +13773,37 @@
         <w:rPr>
           <w:rFonts w:hint="eastAsia"/>
         </w:rPr>
-        <w:t xml:space="preserve"> 3</w:t>
-      </w:r>
-      <w:r>
-        <w:rPr>
-          <w:rFonts w:hint="eastAsia"/>
-        </w:rPr>
-        <w:t>」：从下列四个研究项目中任选三项完成，每项占</w:t>
-      </w:r>
-      <w:r>
-        <w:rPr>
-          <w:rFonts w:hint="eastAsia"/>
-        </w:rPr>
-        <w:t xml:space="preserve"> 30%</w:t>
-      </w:r>
-      <w:r>
-        <w:rPr>
-          <w:rFonts w:hint="eastAsia"/>
-        </w:rPr>
-        <w:t>；组队不超过</w:t>
+        <w:t xml:space="preserve"> 1</w:t>
+      </w:r>
+      <w:r>
+        <w:rPr>
+          <w:rFonts w:hint="eastAsia"/>
+        </w:rPr>
+        <w:t>」：从下列四个研究项目中任选一项完成即可。与以往课程相比，本学期项目更加开放——题目与数据可自选、鼓励结合</w:t>
+      </w:r>
+      <w:r>
+        <w:rPr>
+          <w:rFonts w:hint="eastAsia"/>
+        </w:rPr>
+        <w:t xml:space="preserve"> AI </w:t>
+      </w:r>
+      <w:r>
+        <w:rPr>
+          <w:rFonts w:hint="eastAsia"/>
+        </w:rPr>
+        <w:t>工具完成（须按第</w:t>
+      </w:r>
+      <w:r>
+        <w:rPr>
+          <w:rFonts w:hint="eastAsia"/>
+        </w:rPr>
+        <w:t xml:space="preserve"> 10 </w:t>
+      </w:r>
+      <w:r>
+        <w:rPr>
+          <w:rFonts w:hint="eastAsia"/>
+        </w:rPr>
+        <w:t>节规范声明与核验），具体项目内容与提交要求将于课堂上公布（待公布）。组队不超过</w:t>
       </w:r>
       <w:r>
         <w:rPr>
@@ -13841,7 +13881,6 @@
                 <w:color w:val="FFFFFF"/>
                 <w:sz w:val="19"/>
               </w:rPr>
-              <w:lastRenderedPageBreak/>
               <w:t>项目</w:t>
             </w:r>
             <w:r>
@@ -14019,21 +14058,7 @@
                 <w:rFonts w:hint="eastAsia"/>
                 <w:sz w:val="19"/>
               </w:rPr>
-              <w:t>在项目</w:t>
-            </w:r>
-            <w:r>
-              <w:rPr>
-                <w:rFonts w:hint="eastAsia"/>
-                <w:sz w:val="19"/>
-              </w:rPr>
-              <w:t xml:space="preserve"> 1 </w:t>
-            </w:r>
-            <w:r>
-              <w:rPr>
-                <w:rFonts w:hint="eastAsia"/>
-                <w:sz w:val="19"/>
-              </w:rPr>
-              <w:t>的数据上建立监督学习模型（线性模型、树模型或神经网络），完成特征工程、交叉验证、性能评估与误差分析，并解释关键特征。</w:t>
+              <w:t>自选数据上建立监督学习模型（线性模型、树模型或神经网络），完成特征工程、交叉验证、性能评估与误差分析，并解释关键特征。</w:t>
             </w:r>
           </w:p>
         </w:tc>
@@ -14182,6 +14207,7 @@
             <w:tcW w:w="2447" w:type="dxa"/>
             <w:tcBorders>
               <w:top w:val="single" w:sz="4" w:space="0" w:color="D6CDD0"/>
+              <w:bottom w:val="single" w:sz="4" w:space="0" w:color="D6CDD0"/>
             </w:tcBorders>
             <w:vAlign w:val="center"/>
           </w:tcPr>
@@ -14221,6 +14247,7 @@
             <w:tcW w:w="6966" w:type="dxa"/>
             <w:tcBorders>
               <w:top w:val="single" w:sz="4" w:space="0" w:color="D6CDD0"/>
+              <w:bottom w:val="single" w:sz="4" w:space="0" w:color="D6CDD0"/>
             </w:tcBorders>
             <w:vAlign w:val="center"/>
           </w:tcPr>
@@ -14308,6 +14335,82 @@
                 <w:sz w:val="19"/>
               </w:rPr>
               <w:t>营销场景完成综合分析。</w:t>
+            </w:r>
+          </w:p>
+        </w:tc>
+      </w:tr>
+      <w:tr>
+        <w:tblPrEx>
+          <w:tblCellMar>
+            <w:top w:w="0" w:type="dxa"/>
+            <w:bottom w:w="0" w:type="dxa"/>
+          </w:tblCellMar>
+        </w:tblPrEx>
+        <w:tc>
+          <w:tcPr>
+            <w:tcW w:w="2447" w:type="dxa"/>
+            <w:tcBorders>
+              <w:top w:val="single" w:sz="4" w:space="0" w:color="D6CDD0"/>
+              <w:bottom w:val="single" w:sz="8" w:space="0" w:color="8A0C3C"/>
+            </w:tcBorders>
+            <w:shd w:val="clear" w:color="auto" w:fill="F9F4F5"/>
+            <w:vAlign w:val="center"/>
+          </w:tcPr>
+          <w:p>
+            <w:pPr>
+              <w:spacing w:after="40" w:line="21" w:lineRule="auto"/>
+              <w:rPr>
+                <w:rFonts w:hint="eastAsia"/>
+                <w:sz w:val="19"/>
+              </w:rPr>
+            </w:pPr>
+            <w:r>
+              <w:rPr>
+                <w:rFonts w:hint="eastAsia"/>
+                <w:sz w:val="19"/>
+              </w:rPr>
+              <w:t>项目说明（待公布）</w:t>
+            </w:r>
+          </w:p>
+        </w:tc>
+        <w:tc>
+          <w:tcPr>
+            <w:tcW w:w="6966" w:type="dxa"/>
+            <w:tcBorders>
+              <w:top w:val="single" w:sz="4" w:space="0" w:color="D6CDD0"/>
+              <w:bottom w:val="single" w:sz="8" w:space="0" w:color="8A0C3C"/>
+            </w:tcBorders>
+            <w:shd w:val="clear" w:color="auto" w:fill="F9F4F5"/>
+            <w:vAlign w:val="center"/>
+          </w:tcPr>
+          <w:p>
+            <w:pPr>
+              <w:spacing w:after="40" w:line="21" w:lineRule="auto"/>
+              <w:rPr>
+                <w:rFonts w:hint="eastAsia"/>
+                <w:sz w:val="19"/>
+              </w:rPr>
+            </w:pPr>
+            <w:r>
+              <w:rPr>
+                <w:rFonts w:hint="eastAsia"/>
+                <w:sz w:val="19"/>
+              </w:rPr>
+              <w:t>四个项目的具体题目、数据、任务与评分细则将于课堂上公布；项目较以往课程更加开放，允许自选数据与研究问题，并鼓励使用</w:t>
+            </w:r>
+            <w:r>
+              <w:rPr>
+                <w:rFonts w:hint="eastAsia"/>
+                <w:sz w:val="19"/>
+              </w:rPr>
+              <w:t xml:space="preserve"> AI </w:t>
+            </w:r>
+            <w:r>
+              <w:rPr>
+                <w:rFonts w:hint="eastAsia"/>
+                <w:sz w:val="19"/>
+              </w:rPr>
+              <w:t>工具（须声明与核验）。</w:t>
             </w:r>
           </w:p>
         </w:tc>
@@ -14318,6 +14421,42 @@
         <w:jc w:val="left"/>
         <w:rPr>
           <w:rFonts w:hint="eastAsia"/>
+          <w:color w:val="8A0C3C"/>
+          <w:u w:val="single"/>
+        </w:rPr>
+      </w:pPr>
+      <w:hyperlink r:id="rId6" w:tooltip="https://elysium4eva.github.io/project/" w:history="1">
+        <w:r>
+          <w:rPr>
+            <w:rStyle w:val="ae"/>
+            <w:rFonts w:hint="eastAsia"/>
+            <w:color w:val="8A0C3C"/>
+          </w:rPr>
+          <w:t>往期课程项目报告</w:t>
+        </w:r>
+        <w:r>
+          <w:rPr>
+            <w:rStyle w:val="ae"/>
+            <w:rFonts w:hint="eastAsia"/>
+            <w:color w:val="8A0C3C"/>
+          </w:rPr>
+          <w:t xml:space="preserve"> Past Project Reports</w:t>
+        </w:r>
+        <w:r>
+          <w:rPr>
+            <w:rStyle w:val="ae"/>
+            <w:rFonts w:hint="eastAsia"/>
+            <w:color w:val="8A0C3C"/>
+          </w:rPr>
+          <w:t>（选题与写法参考）</w:t>
+        </w:r>
+      </w:hyperlink>
+    </w:p>
+    <w:p>
+      <w:pPr>
+        <w:jc w:val="left"/>
+        <w:rPr>
+          <w:rFonts w:hint="eastAsia"/>
         </w:rPr>
       </w:pPr>
       <w:r>
@@ -14358,7 +14497,7 @@
           <w:rFonts w:hint="eastAsia"/>
         </w:rPr>
       </w:pPr>
-      <w:bookmarkStart w:id="21" w:name="_Toc240559681"/>
+      <w:bookmarkStart w:id="21" w:name="_Toc240561336"/>
       <w:r>
         <w:rPr>
           <w:rFonts w:hint="eastAsia"/>
@@ -14375,7 +14514,7 @@
         <w:rPr>
           <w:rFonts w:hint="eastAsia"/>
         </w:rPr>
-        <w:t>（每项满分</w:t>
+        <w:t>（项目满分</w:t>
       </w:r>
       <w:r>
         <w:rPr>
@@ -14985,7 +15124,7 @@
           <w:rFonts w:hint="eastAsia"/>
         </w:rPr>
       </w:pPr>
-      <w:bookmarkStart w:id="22" w:name="_Toc240559682"/>
+      <w:bookmarkStart w:id="22" w:name="_Toc240561337"/>
       <w:r>
         <w:rPr>
           <w:rFonts w:hint="eastAsia"/>
@@ -15007,7 +15146,7 @@
           <w:rFonts w:hint="eastAsia"/>
         </w:rPr>
       </w:pPr>
-      <w:bookmarkStart w:id="23" w:name="_Toc240559683"/>
+      <w:bookmarkStart w:id="23" w:name="_Toc240561338"/>
       <w:r>
         <w:rPr>
           <w:rFonts w:hint="eastAsia"/>
@@ -15068,7 +15207,7 @@
           <w:rFonts w:hint="eastAsia"/>
         </w:rPr>
       </w:pPr>
-      <w:bookmarkStart w:id="24" w:name="_Toc240559684"/>
+      <w:bookmarkStart w:id="24" w:name="_Toc240561339"/>
       <w:r>
         <w:rPr>
           <w:rFonts w:hint="eastAsia"/>
@@ -15153,7 +15292,7 @@
           <w:rFonts w:hint="eastAsia"/>
         </w:rPr>
       </w:pPr>
-      <w:bookmarkStart w:id="25" w:name="_Toc240559685"/>
+      <w:bookmarkStart w:id="25" w:name="_Toc240561340"/>
       <w:r>
         <w:rPr>
           <w:rFonts w:hint="eastAsia"/>
@@ -15216,7 +15355,14 @@
         <w:rPr>
           <w:rFonts w:hint="eastAsia"/>
         </w:rPr>
-        <w:t>协定）效果评估；全球价值链与投入产出分析；供应链韧性预警；跨境电商平台数据分析。</w:t>
+        <w:t>协定）效果评估；全球价值链与投入产出分析；供应</w:t>
+      </w:r>
+      <w:r>
+        <w:rPr>
+          <w:rFonts w:hint="eastAsia"/>
+        </w:rPr>
+        <w:lastRenderedPageBreak/>
+        <w:t>链韧性预警；跨境电商平台数据分析。</w:t>
       </w:r>
     </w:p>
     <w:p>
@@ -15252,12 +15398,11 @@
           <w:rFonts w:hint="eastAsia"/>
         </w:rPr>
       </w:pPr>
-      <w:bookmarkStart w:id="26" w:name="_Toc240559686"/>
-      <w:r>
-        <w:rPr>
-          <w:rFonts w:hint="eastAsia"/>
-        </w:rPr>
-        <w:lastRenderedPageBreak/>
+      <w:bookmarkStart w:id="26" w:name="_Toc240561341"/>
+      <w:r>
+        <w:rPr>
+          <w:rFonts w:hint="eastAsia"/>
+        </w:rPr>
         <w:t>八、工具与软件</w:t>
       </w:r>
       <w:r>
@@ -16220,7 +16365,7 @@
           <w:rFonts w:hint="eastAsia"/>
         </w:rPr>
       </w:pPr>
-      <w:bookmarkStart w:id="27" w:name="_Toc240559687"/>
+      <w:bookmarkStart w:id="27" w:name="_Toc240561342"/>
       <w:r>
         <w:rPr>
           <w:rFonts w:hint="eastAsia"/>
@@ -16242,7 +16387,7 @@
           <w:rFonts w:hint="eastAsia"/>
         </w:rPr>
       </w:pPr>
-      <w:bookmarkStart w:id="28" w:name="_Toc240559688"/>
+      <w:bookmarkStart w:id="28" w:name="_Toc240561343"/>
       <w:r>
         <w:rPr>
           <w:rFonts w:hint="eastAsia"/>
@@ -16291,7 +16436,7 @@
           <w:rFonts w:hint="eastAsia"/>
         </w:rPr>
       </w:pPr>
-      <w:bookmarkStart w:id="29" w:name="_Toc240559689"/>
+      <w:bookmarkStart w:id="29" w:name="_Toc240561344"/>
       <w:r>
         <w:rPr>
           <w:rFonts w:hint="eastAsia"/>
@@ -16651,6 +16796,7 @@
         <w:rPr>
           <w:rFonts w:hint="eastAsia"/>
         </w:rPr>
+        <w:lastRenderedPageBreak/>
         <w:t>•</w:t>
       </w:r>
       <w:r>
@@ -16667,7 +16813,7 @@
           <w:rFonts w:hint="eastAsia"/>
         </w:rPr>
       </w:pPr>
-      <w:bookmarkStart w:id="30" w:name="_Toc240559690"/>
+      <w:bookmarkStart w:id="30" w:name="_Toc240561345"/>
       <w:r>
         <w:rPr>
           <w:rFonts w:hint="eastAsia"/>
@@ -16745,7 +16891,6 @@
         <w:rPr>
           <w:rFonts w:hint="eastAsia"/>
         </w:rPr>
-        <w:lastRenderedPageBreak/>
         <w:t>•</w:t>
       </w:r>
       <w:r>
@@ -16942,7 +17087,7 @@
           <w:rFonts w:hint="eastAsia"/>
         </w:rPr>
       </w:pPr>
-      <w:bookmarkStart w:id="31" w:name="_Toc240559691"/>
+      <w:bookmarkStart w:id="31" w:name="_Toc240561346"/>
       <w:r>
         <w:rPr>
           <w:rFonts w:hint="eastAsia"/>
@@ -16981,7 +17126,31 @@
         <w:rPr>
           <w:rFonts w:hint="eastAsia"/>
         </w:rPr>
-        <w:t>出勤与参与：鼓励全程参与课堂讨论与实操；无故缺席影响课堂展示评分。</w:t>
+        <w:t>出勤与参与：出勤计入总成绩的</w:t>
+      </w:r>
+      <w:r>
+        <w:rPr>
+          <w:rFonts w:hint="eastAsia"/>
+        </w:rPr>
+        <w:t xml:space="preserve"> 10%</w:t>
+      </w:r>
+      <w:r>
+        <w:rPr>
+          <w:rFonts w:hint="eastAsia"/>
+        </w:rPr>
+        <w:t>；无故缺席按次扣分（缺席累计超过</w:t>
+      </w:r>
+      <w:r>
+        <w:rPr>
+          <w:rFonts w:hint="eastAsia"/>
+        </w:rPr>
+        <w:t xml:space="preserve"> 1/3 </w:t>
+      </w:r>
+      <w:r>
+        <w:rPr>
+          <w:rFonts w:hint="eastAsia"/>
+        </w:rPr>
+        <w:t>按学校规定处理）；课堂讨论与实操鼓励全程参与。</w:t>
       </w:r>
     </w:p>
     <w:p>
@@ -17270,7 +17439,7 @@
           <w:rFonts w:hint="eastAsia"/>
         </w:rPr>
       </w:pPr>
-      <w:bookmarkStart w:id="32" w:name="_Toc240559692"/>
+      <w:bookmarkStart w:id="32" w:name="_Toc240561347"/>
       <w:r>
         <w:rPr>
           <w:rFonts w:hint="eastAsia"/>
@@ -17532,12 +17701,12 @@
       </w:pPr>
     </w:p>
     <w:sectPr>
-      <w:headerReference w:type="even" r:id="rId6"/>
-      <w:headerReference w:type="default" r:id="rId7"/>
-      <w:footerReference w:type="even" r:id="rId8"/>
-      <w:footerReference w:type="default" r:id="rId9"/>
-      <w:headerReference w:type="first" r:id="rId10"/>
-      <w:footerReference w:type="first" r:id="rId11"/>
+      <w:headerReference w:type="even" r:id="rId7"/>
+      <w:headerReference w:type="default" r:id="rId8"/>
+      <w:footerReference w:type="even" r:id="rId9"/>
+      <w:footerReference w:type="default" r:id="rId10"/>
+      <w:headerReference w:type="first" r:id="rId11"/>
+      <w:footerReference w:type="first" r:id="rId12"/>
       <w:pgSz w:w="11907" w:h="16839"/>
       <w:pgMar w:top="1134" w:right="1247" w:bottom="1134" w:left="1247" w:header="851" w:footer="992" w:gutter="0"/>
       <w:cols w:space="425"/>
@@ -17582,7 +17751,7 @@
 <w:ftr xmlns:wpc="http://schemas.microsoft.com/office/word/2010/wordprocessingCanvas" xmlns:cx="http://schemas.microsoft.com/office/drawing/2014/chartex" xmlns:cx1="http://schemas.microsoft.com/office/drawing/2015/9/8/chartex" xmlns:cx2="http://schemas.microsoft.com/office/drawing/2015/10/21/chartex" xmlns:cx3="http://schemas.microsoft.com/office/drawing/2016/5/9/chartex" xmlns:cx4="http://schemas.microsoft.com/office/drawing/2016/5/10/chartex" xmlns:cx5="http://schemas.microsoft.com/office/drawing/2016/5/11/chartex" xmlns:cx6="http://schemas.microsoft.com/office/drawing/2016/5/12/chartex" xmlns:cx7="http://schemas.microsoft.com/office/drawing/2016/5/13/chartex" xmlns:cx8="http://schemas.microsoft.com/office/drawing/2016/5/14/chartex" xmlns:mc="http://schemas.openxmlformats.org/markup-compatibility/2006" xmlns:aink="http://schemas.microsoft.com/office/drawing/2016/ink" xmlns:am3d="http://schemas.microsoft.com/office/drawing/2017/model3d" xmlns:o="urn:schemas-microsoft-com:office:office" xmlns:oel="http://schemas.microsoft.com/office/2019/extlst" xmlns:r="http://schemas.openxmlformats.org/officeDocument/2006/relationships" xmlns:m="http://schemas.openxmlformats.org/officeDocument/2006/math" xmlns:v="urn:schemas-microsoft-com:vml" xmlns:wp14="http://schemas.microsoft.com/office/word/2010/wordprocessingDrawing" xmlns:wp="http://schemas.openxmlformats.org/drawingml/2006/wordprocessingDrawing" xmlns:w10="urn:schemas-microsoft-com:office:word" xmlns:w="http://schemas.openxmlformats.org/wordprocessingml/2006/main" xmlns:w14="http://schemas.microsoft.com/office/word/2010/wordml" xmlns:w15="http://schemas.microsoft.com/office/word/2012/wordml" xmlns:w16cex="http://schemas.microsoft.com/office/word/2018/wordml/cex" xmlns:w16cid="http://schemas.microsoft.com/office/word/2016/wordml/cid" xmlns:w16="http://schemas.microsoft.com/office/word/2018/wordml" xmlns:w16du="http://schemas.microsoft.com/office/word/2023/wordml/word16du" xmlns:w16sdtdh="http://schemas.microsoft.com/office/word/2020/wordml/sdtdatahash" xmlns:w16sdtfl="http://schemas.microsoft.com/office/word/2024/wordml/sdtformatlock" xmlns:w16se="http://schemas.microsoft.com/office/word/2015/wordml/symex" xmlns:wpg="http://schemas.microsoft.com/office/word/2010/wordprocessingGroup" xmlns:wpi="http://schemas.microsoft.com/office/word/2010/wordprocessingInk" xmlns:wne="http://schemas.microsoft.com/office/word/2006/wordml" xmlns:wps="http://schemas.microsoft.com/office/word/2010/wordprocessingShape" mc:Ignorable="w14 w15 w16se w16cid w16 w16cex w16sdtdh w16sdtfl w16du wp14">
   <w:p>
     <w:pPr>
-      <w:pStyle w:val="af0"/>
+      <w:pStyle w:val="af2"/>
       <w:rPr>
         <w:rFonts w:hint="eastAsia"/>
       </w:rPr>
@@ -17595,7 +17764,7 @@
 <w:ftr xmlns:wpc="http://schemas.microsoft.com/office/word/2010/wordprocessingCanvas" xmlns:cx="http://schemas.microsoft.com/office/drawing/2014/chartex" xmlns:cx1="http://schemas.microsoft.com/office/drawing/2015/9/8/chartex" xmlns:cx2="http://schemas.microsoft.com/office/drawing/2015/10/21/chartex" xmlns:cx3="http://schemas.microsoft.com/office/drawing/2016/5/9/chartex" xmlns:cx4="http://schemas.microsoft.com/office/drawing/2016/5/10/chartex" xmlns:cx5="http://schemas.microsoft.com/office/drawing/2016/5/11/chartex" xmlns:cx6="http://schemas.microsoft.com/office/drawing/2016/5/12/chartex" xmlns:cx7="http://schemas.microsoft.com/office/drawing/2016/5/13/chartex" xmlns:cx8="http://schemas.microsoft.com/office/drawing/2016/5/14/chartex" xmlns:mc="http://schemas.openxmlformats.org/markup-compatibility/2006" xmlns:aink="http://schemas.microsoft.com/office/drawing/2016/ink" xmlns:am3d="http://schemas.microsoft.com/office/drawing/2017/model3d" xmlns:o="urn:schemas-microsoft-com:office:office" xmlns:oel="http://schemas.microsoft.com/office/2019/extlst" xmlns:r="http://schemas.openxmlformats.org/officeDocument/2006/relationships" xmlns:m="http://schemas.openxmlformats.org/officeDocument/2006/math" xmlns:v="urn:schemas-microsoft-com:vml" xmlns:wp14="http://schemas.microsoft.com/office/word/2010/wordprocessingDrawing" xmlns:wp="http://schemas.openxmlformats.org/drawingml/2006/wordprocessingDrawing" xmlns:w10="urn:schemas-microsoft-com:office:word" xmlns:w="http://schemas.openxmlformats.org/wordprocessingml/2006/main" xmlns:w14="http://schemas.microsoft.com/office/word/2010/wordml" xmlns:w15="http://schemas.microsoft.com/office/word/2012/wordml" xmlns:w16cex="http://schemas.microsoft.com/office/word/2018/wordml/cex" xmlns:w16cid="http://schemas.microsoft.com/office/word/2016/wordml/cid" xmlns:w16="http://schemas.microsoft.com/office/word/2018/wordml" xmlns:w16du="http://schemas.microsoft.com/office/word/2023/wordml/word16du" xmlns:w16sdtdh="http://schemas.microsoft.com/office/word/2020/wordml/sdtdatahash" xmlns:w16sdtfl="http://schemas.microsoft.com/office/word/2024/wordml/sdtformatlock" xmlns:w16se="http://schemas.microsoft.com/office/word/2015/wordml/symex" xmlns:wpg="http://schemas.microsoft.com/office/word/2010/wordprocessingGroup" xmlns:wpi="http://schemas.microsoft.com/office/word/2010/wordprocessingInk" xmlns:wne="http://schemas.microsoft.com/office/word/2006/wordml" xmlns:wps="http://schemas.microsoft.com/office/word/2010/wordprocessingShape" mc:Ignorable="w14 w15 w16se w16cid w16 w16cex w16sdtdh w16sdtfl w16du wp14">
   <w:p>
     <w:pPr>
-      <w:pStyle w:val="af0"/>
+      <w:pStyle w:val="af2"/>
       <w:jc w:val="center"/>
       <w:rPr>
         <w:rFonts w:hint="eastAsia"/>
@@ -17682,7 +17851,7 @@
         <w:color w:val="66717D"/>
         <w:sz w:val="17"/>
       </w:rPr>
-      <w:t>7</w:t>
+      <w:t>10</w:t>
     </w:r>
     <w:r>
       <w:rPr>
@@ -17763,7 +17932,7 @@
         <w:color w:val="66717D"/>
         <w:sz w:val="17"/>
       </w:rPr>
-      <w:t>8</w:t>
+      <w:t>10</w:t>
     </w:r>
     <w:r>
       <w:rPr>
@@ -17797,7 +17966,7 @@
 <w:ftr xmlns:wpc="http://schemas.microsoft.com/office/word/2010/wordprocessingCanvas" xmlns:cx="http://schemas.microsoft.com/office/drawing/2014/chartex" xmlns:cx1="http://schemas.microsoft.com/office/drawing/2015/9/8/chartex" xmlns:cx2="http://schemas.microsoft.com/office/drawing/2015/10/21/chartex" xmlns:cx3="http://schemas.microsoft.com/office/drawing/2016/5/9/chartex" xmlns:cx4="http://schemas.microsoft.com/office/drawing/2016/5/10/chartex" xmlns:cx5="http://schemas.microsoft.com/office/drawing/2016/5/11/chartex" xmlns:cx6="http://schemas.microsoft.com/office/drawing/2016/5/12/chartex" xmlns:cx7="http://schemas.microsoft.com/office/drawing/2016/5/13/chartex" xmlns:cx8="http://schemas.microsoft.com/office/drawing/2016/5/14/chartex" xmlns:mc="http://schemas.openxmlformats.org/markup-compatibility/2006" xmlns:aink="http://schemas.microsoft.com/office/drawing/2016/ink" xmlns:am3d="http://schemas.microsoft.com/office/drawing/2017/model3d" xmlns:o="urn:schemas-microsoft-com:office:office" xmlns:oel="http://schemas.microsoft.com/office/2019/extlst" xmlns:r="http://schemas.openxmlformats.org/officeDocument/2006/relationships" xmlns:m="http://schemas.openxmlformats.org/officeDocument/2006/math" xmlns:v="urn:schemas-microsoft-com:vml" xmlns:wp14="http://schemas.microsoft.com/office/word/2010/wordprocessingDrawing" xmlns:wp="http://schemas.openxmlformats.org/drawingml/2006/wordprocessingDrawing" xmlns:w10="urn:schemas-microsoft-com:office:word" xmlns:w="http://schemas.openxmlformats.org/wordprocessingml/2006/main" xmlns:w14="http://schemas.microsoft.com/office/word/2010/wordml" xmlns:w15="http://schemas.microsoft.com/office/word/2012/wordml" xmlns:w16cex="http://schemas.microsoft.com/office/word/2018/wordml/cex" xmlns:w16cid="http://schemas.microsoft.com/office/word/2016/wordml/cid" xmlns:w16="http://schemas.microsoft.com/office/word/2018/wordml" xmlns:w16du="http://schemas.microsoft.com/office/word/2023/wordml/word16du" xmlns:w16sdtdh="http://schemas.microsoft.com/office/word/2020/wordml/sdtdatahash" xmlns:w16sdtfl="http://schemas.microsoft.com/office/word/2024/wordml/sdtformatlock" xmlns:w16se="http://schemas.microsoft.com/office/word/2015/wordml/symex" xmlns:wpg="http://schemas.microsoft.com/office/word/2010/wordprocessingGroup" xmlns:wpi="http://schemas.microsoft.com/office/word/2010/wordprocessingInk" xmlns:wne="http://schemas.microsoft.com/office/word/2006/wordml" xmlns:wps="http://schemas.microsoft.com/office/word/2010/wordprocessingShape" mc:Ignorable="w14 w15 w16se w16cid w16 w16cex w16sdtdh w16sdtfl w16du wp14">
   <w:p>
     <w:pPr>
-      <w:pStyle w:val="af0"/>
+      <w:pStyle w:val="af2"/>
       <w:rPr>
         <w:rFonts w:hint="eastAsia"/>
       </w:rPr>
@@ -17841,7 +18010,7 @@
 <w:hdr xmlns:wpc="http://schemas.microsoft.com/office/word/2010/wordprocessingCanvas" xmlns:cx="http://schemas.microsoft.com/office/drawing/2014/chartex" xmlns:cx1="http://schemas.microsoft.com/office/drawing/2015/9/8/chartex" xmlns:cx2="http://schemas.microsoft.com/office/drawing/2015/10/21/chartex" xmlns:cx3="http://schemas.microsoft.com/office/drawing/2016/5/9/chartex" xmlns:cx4="http://schemas.microsoft.com/office/drawing/2016/5/10/chartex" xmlns:cx5="http://schemas.microsoft.com/office/drawing/2016/5/11/chartex" xmlns:cx6="http://schemas.microsoft.com/office/drawing/2016/5/12/chartex" xmlns:cx7="http://schemas.microsoft.com/office/drawing/2016/5/13/chartex" xmlns:cx8="http://schemas.microsoft.com/office/drawing/2016/5/14/chartex" xmlns:mc="http://schemas.openxmlformats.org/markup-compatibility/2006" xmlns:aink="http://schemas.microsoft.com/office/drawing/2016/ink" xmlns:am3d="http://schemas.microsoft.com/office/drawing/2017/model3d" xmlns:o="urn:schemas-microsoft-com:office:office" xmlns:oel="http://schemas.microsoft.com/office/2019/extlst" xmlns:r="http://schemas.openxmlformats.org/officeDocument/2006/relationships" xmlns:m="http://schemas.openxmlformats.org/officeDocument/2006/math" xmlns:v="urn:schemas-microsoft-com:vml" xmlns:wp14="http://schemas.microsoft.com/office/word/2010/wordprocessingDrawing" xmlns:wp="http://schemas.openxmlformats.org/drawingml/2006/wordprocessingDrawing" xmlns:w10="urn:schemas-microsoft-com:office:word" xmlns:w="http://schemas.openxmlformats.org/wordprocessingml/2006/main" xmlns:w14="http://schemas.microsoft.com/office/word/2010/wordml" xmlns:w15="http://schemas.microsoft.com/office/word/2012/wordml" xmlns:w16cex="http://schemas.microsoft.com/office/word/2018/wordml/cex" xmlns:w16cid="http://schemas.microsoft.com/office/word/2016/wordml/cid" xmlns:w16="http://schemas.microsoft.com/office/word/2018/wordml" xmlns:w16du="http://schemas.microsoft.com/office/word/2023/wordml/word16du" xmlns:w16sdtdh="http://schemas.microsoft.com/office/word/2020/wordml/sdtdatahash" xmlns:w16sdtfl="http://schemas.microsoft.com/office/word/2024/wordml/sdtformatlock" xmlns:w16se="http://schemas.microsoft.com/office/word/2015/wordml/symex" xmlns:wpg="http://schemas.microsoft.com/office/word/2010/wordprocessingGroup" xmlns:wpi="http://schemas.microsoft.com/office/word/2010/wordprocessingInk" xmlns:wne="http://schemas.microsoft.com/office/word/2006/wordml" xmlns:wps="http://schemas.microsoft.com/office/word/2010/wordprocessingShape" mc:Ignorable="w14 w15 w16se w16cid w16 w16cex w16sdtdh w16sdtfl w16du wp14">
   <w:p>
     <w:pPr>
-      <w:pStyle w:val="ae"/>
+      <w:pStyle w:val="af0"/>
       <w:rPr>
         <w:rFonts w:hint="eastAsia"/>
       </w:rPr>
@@ -17854,7 +18023,7 @@
 <w:hdr xmlns:wpc="http://schemas.microsoft.com/office/word/2010/wordprocessingCanvas" xmlns:cx="http://schemas.microsoft.com/office/drawing/2014/chartex" xmlns:cx1="http://schemas.microsoft.com/office/drawing/2015/9/8/chartex" xmlns:cx2="http://schemas.microsoft.com/office/drawing/2015/10/21/chartex" xmlns:cx3="http://schemas.microsoft.com/office/drawing/2016/5/9/chartex" xmlns:cx4="http://schemas.microsoft.com/office/drawing/2016/5/10/chartex" xmlns:cx5="http://schemas.microsoft.com/office/drawing/2016/5/11/chartex" xmlns:cx6="http://schemas.microsoft.com/office/drawing/2016/5/12/chartex" xmlns:cx7="http://schemas.microsoft.com/office/drawing/2016/5/13/chartex" xmlns:cx8="http://schemas.microsoft.com/office/drawing/2016/5/14/chartex" xmlns:mc="http://schemas.openxmlformats.org/markup-compatibility/2006" xmlns:aink="http://schemas.microsoft.com/office/drawing/2016/ink" xmlns:am3d="http://schemas.microsoft.com/office/drawing/2017/model3d" xmlns:o="urn:schemas-microsoft-com:office:office" xmlns:oel="http://schemas.microsoft.com/office/2019/extlst" xmlns:r="http://schemas.openxmlformats.org/officeDocument/2006/relationships" xmlns:m="http://schemas.openxmlformats.org/officeDocument/2006/math" xmlns:v="urn:schemas-microsoft-com:vml" xmlns:wp14="http://schemas.microsoft.com/office/word/2010/wordprocessingDrawing" xmlns:wp="http://schemas.openxmlformats.org/drawingml/2006/wordprocessingDrawing" xmlns:w10="urn:schemas-microsoft-com:office:word" xmlns:w="http://schemas.openxmlformats.org/wordprocessingml/2006/main" xmlns:w14="http://schemas.microsoft.com/office/word/2010/wordml" xmlns:w15="http://schemas.microsoft.com/office/word/2012/wordml" xmlns:w16cex="http://schemas.microsoft.com/office/word/2018/wordml/cex" xmlns:w16cid="http://schemas.microsoft.com/office/word/2016/wordml/cid" xmlns:w16="http://schemas.microsoft.com/office/word/2018/wordml" xmlns:w16du="http://schemas.microsoft.com/office/word/2023/wordml/word16du" xmlns:w16sdtdh="http://schemas.microsoft.com/office/word/2020/wordml/sdtdatahash" xmlns:w16sdtfl="http://schemas.microsoft.com/office/word/2024/wordml/sdtformatlock" xmlns:w16se="http://schemas.microsoft.com/office/word/2015/wordml/symex" xmlns:wpg="http://schemas.microsoft.com/office/word/2010/wordprocessingGroup" xmlns:wpi="http://schemas.microsoft.com/office/word/2010/wordprocessingInk" xmlns:wne="http://schemas.microsoft.com/office/word/2006/wordml" xmlns:wps="http://schemas.microsoft.com/office/word/2010/wordprocessingShape" mc:Ignorable="w14 w15 w16se w16cid w16 w16cex w16sdtdh w16sdtfl w16du wp14">
   <w:p>
     <w:pPr>
-      <w:pStyle w:val="ae"/>
+      <w:pStyle w:val="af0"/>
       <w:rPr>
         <w:rFonts w:hint="eastAsia"/>
       </w:rPr>
@@ -17867,7 +18036,7 @@
 <w:hdr xmlns:wpc="http://schemas.microsoft.com/office/word/2010/wordprocessingCanvas" xmlns:cx="http://schemas.microsoft.com/office/drawing/2014/chartex" xmlns:cx1="http://schemas.microsoft.com/office/drawing/2015/9/8/chartex" xmlns:cx2="http://schemas.microsoft.com/office/drawing/2015/10/21/chartex" xmlns:cx3="http://schemas.microsoft.com/office/drawing/2016/5/9/chartex" xmlns:cx4="http://schemas.microsoft.com/office/drawing/2016/5/10/chartex" xmlns:cx5="http://schemas.microsoft.com/office/drawing/2016/5/11/chartex" xmlns:cx6="http://schemas.microsoft.com/office/drawing/2016/5/12/chartex" xmlns:cx7="http://schemas.microsoft.com/office/drawing/2016/5/13/chartex" xmlns:cx8="http://schemas.microsoft.com/office/drawing/2016/5/14/chartex" xmlns:mc="http://schemas.openxmlformats.org/markup-compatibility/2006" xmlns:aink="http://schemas.microsoft.com/office/drawing/2016/ink" xmlns:am3d="http://schemas.microsoft.com/office/drawing/2017/model3d" xmlns:o="urn:schemas-microsoft-com:office:office" xmlns:oel="http://schemas.microsoft.com/office/2019/extlst" xmlns:r="http://schemas.openxmlformats.org/officeDocument/2006/relationships" xmlns:m="http://schemas.openxmlformats.org/officeDocument/2006/math" xmlns:v="urn:schemas-microsoft-com:vml" xmlns:wp14="http://schemas.microsoft.com/office/word/2010/wordprocessingDrawing" xmlns:wp="http://schemas.openxmlformats.org/drawingml/2006/wordprocessingDrawing" xmlns:w10="urn:schemas-microsoft-com:office:word" xmlns:w="http://schemas.openxmlformats.org/wordprocessingml/2006/main" xmlns:w14="http://schemas.microsoft.com/office/word/2010/wordml" xmlns:w15="http://schemas.microsoft.com/office/word/2012/wordml" xmlns:w16cex="http://schemas.microsoft.com/office/word/2018/wordml/cex" xmlns:w16cid="http://schemas.microsoft.com/office/word/2016/wordml/cid" xmlns:w16="http://schemas.microsoft.com/office/word/2018/wordml" xmlns:w16du="http://schemas.microsoft.com/office/word/2023/wordml/word16du" xmlns:w16sdtdh="http://schemas.microsoft.com/office/word/2020/wordml/sdtdatahash" xmlns:w16sdtfl="http://schemas.microsoft.com/office/word/2024/wordml/sdtformatlock" xmlns:w16se="http://schemas.microsoft.com/office/word/2015/wordml/symex" xmlns:wpg="http://schemas.microsoft.com/office/word/2010/wordprocessingGroup" xmlns:wpi="http://schemas.microsoft.com/office/word/2010/wordprocessingInk" xmlns:wne="http://schemas.microsoft.com/office/word/2006/wordml" xmlns:wps="http://schemas.microsoft.com/office/word/2010/wordprocessingShape" mc:Ignorable="w14 w15 w16se w16cid w16 w16cex w16sdtdh w16sdtfl w16du wp14">
   <w:p>
     <w:pPr>
-      <w:pStyle w:val="ae"/>
+      <w:pStyle w:val="af0"/>
       <w:rPr>
         <w:rFonts w:hint="eastAsia"/>
       </w:rPr>
@@ -18288,7 +18457,7 @@
     <w:link w:val="10"/>
     <w:uiPriority w:val="9"/>
     <w:qFormat/>
-    <w:rsid w:val="00240C5B"/>
+    <w:rsid w:val="004639B2"/>
     <w:pPr>
       <w:keepNext/>
       <w:keepLines/>
@@ -18311,7 +18480,7 @@
     <w:uiPriority w:val="9"/>
     <w:unhideWhenUsed/>
     <w:qFormat/>
-    <w:rsid w:val="00240C5B"/>
+    <w:rsid w:val="004639B2"/>
     <w:pPr>
       <w:keepNext/>
       <w:keepLines/>
@@ -18334,7 +18503,7 @@
     <w:semiHidden/>
     <w:unhideWhenUsed/>
     <w:qFormat/>
-    <w:rsid w:val="00240C5B"/>
+    <w:rsid w:val="004639B2"/>
     <w:pPr>
       <w:keepNext/>
       <w:keepLines/>
@@ -18357,7 +18526,7 @@
     <w:semiHidden/>
     <w:unhideWhenUsed/>
     <w:qFormat/>
-    <w:rsid w:val="00240C5B"/>
+    <w:rsid w:val="004639B2"/>
     <w:pPr>
       <w:keepNext/>
       <w:keepLines/>
@@ -18380,7 +18549,7 @@
     <w:semiHidden/>
     <w:unhideWhenUsed/>
     <w:qFormat/>
-    <w:rsid w:val="00240C5B"/>
+    <w:rsid w:val="004639B2"/>
     <w:pPr>
       <w:keepNext/>
       <w:keepLines/>
@@ -18403,7 +18572,7 @@
     <w:semiHidden/>
     <w:unhideWhenUsed/>
     <w:qFormat/>
-    <w:rsid w:val="00240C5B"/>
+    <w:rsid w:val="004639B2"/>
     <w:pPr>
       <w:keepNext/>
       <w:keepLines/>
@@ -18426,7 +18595,7 @@
     <w:semiHidden/>
     <w:unhideWhenUsed/>
     <w:qFormat/>
-    <w:rsid w:val="00240C5B"/>
+    <w:rsid w:val="004639B2"/>
     <w:pPr>
       <w:keepNext/>
       <w:keepLines/>
@@ -18449,7 +18618,7 @@
     <w:semiHidden/>
     <w:unhideWhenUsed/>
     <w:qFormat/>
-    <w:rsid w:val="00240C5B"/>
+    <w:rsid w:val="004639B2"/>
     <w:pPr>
       <w:keepNext/>
       <w:keepLines/>
@@ -18469,7 +18638,7 @@
     <w:semiHidden/>
     <w:unhideWhenUsed/>
     <w:qFormat/>
-    <w:rsid w:val="00240C5B"/>
+    <w:rsid w:val="004639B2"/>
     <w:pPr>
       <w:keepNext/>
       <w:keepLines/>
@@ -18512,7 +18681,7 @@
     <w:basedOn w:val="a0"/>
     <w:link w:val="1"/>
     <w:uiPriority w:val="9"/>
-    <w:rsid w:val="00240C5B"/>
+    <w:rsid w:val="004639B2"/>
     <w:rPr>
       <w:rFonts w:ascii="Arial" w:eastAsia="微软雅黑" w:hAnsiTheme="majorHAnsi" w:cstheme="majorBidi"/>
       <w:b/>
@@ -18526,7 +18695,7 @@
     <w:basedOn w:val="a0"/>
     <w:link w:val="2"/>
     <w:uiPriority w:val="9"/>
-    <w:rsid w:val="00240C5B"/>
+    <w:rsid w:val="004639B2"/>
     <w:rPr>
       <w:rFonts w:ascii="Arial" w:eastAsia="微软雅黑" w:hAnsiTheme="majorHAnsi" w:cstheme="majorBidi"/>
       <w:b/>
@@ -18541,7 +18710,7 @@
     <w:link w:val="3"/>
     <w:uiPriority w:val="9"/>
     <w:semiHidden/>
-    <w:rsid w:val="00240C5B"/>
+    <w:rsid w:val="004639B2"/>
     <w:rPr>
       <w:rFonts w:asciiTheme="majorHAnsi" w:eastAsiaTheme="majorEastAsia" w:hAnsiTheme="majorHAnsi" w:cstheme="majorBidi"/>
       <w:color w:val="2F5496" w:themeColor="accent1" w:themeShade="BF"/>
@@ -18555,7 +18724,7 @@
     <w:link w:val="4"/>
     <w:uiPriority w:val="9"/>
     <w:semiHidden/>
-    <w:rsid w:val="00240C5B"/>
+    <w:rsid w:val="004639B2"/>
     <w:rPr>
       <w:rFonts w:cstheme="majorBidi"/>
       <w:color w:val="2F5496" w:themeColor="accent1" w:themeShade="BF"/>
@@ -18569,7 +18738,7 @@
     <w:link w:val="5"/>
     <w:uiPriority w:val="9"/>
     <w:semiHidden/>
-    <w:rsid w:val="00240C5B"/>
+    <w:rsid w:val="004639B2"/>
     <w:rPr>
       <w:rFonts w:cstheme="majorBidi"/>
       <w:color w:val="2F5496" w:themeColor="accent1" w:themeShade="BF"/>
@@ -18583,7 +18752,7 @@
     <w:link w:val="6"/>
     <w:uiPriority w:val="9"/>
     <w:semiHidden/>
-    <w:rsid w:val="00240C5B"/>
+    <w:rsid w:val="004639B2"/>
     <w:rPr>
       <w:rFonts w:cstheme="majorBidi"/>
       <w:b/>
@@ -18597,7 +18766,7 @@
     <w:link w:val="7"/>
     <w:uiPriority w:val="9"/>
     <w:semiHidden/>
-    <w:rsid w:val="00240C5B"/>
+    <w:rsid w:val="004639B2"/>
     <w:rPr>
       <w:rFonts w:cstheme="majorBidi"/>
       <w:b/>
@@ -18611,7 +18780,7 @@
     <w:link w:val="8"/>
     <w:uiPriority w:val="9"/>
     <w:semiHidden/>
-    <w:rsid w:val="00240C5B"/>
+    <w:rsid w:val="004639B2"/>
     <w:rPr>
       <w:rFonts w:cstheme="majorBidi"/>
       <w:color w:val="595959" w:themeColor="text1" w:themeTint="A6"/>
@@ -18623,7 +18792,7 @@
     <w:link w:val="9"/>
     <w:uiPriority w:val="9"/>
     <w:semiHidden/>
-    <w:rsid w:val="00240C5B"/>
+    <w:rsid w:val="004639B2"/>
     <w:rPr>
       <w:rFonts w:eastAsiaTheme="majorEastAsia" w:cstheme="majorBidi"/>
       <w:color w:val="595959" w:themeColor="text1" w:themeTint="A6"/>
@@ -18636,7 +18805,7 @@
     <w:link w:val="a4"/>
     <w:uiPriority w:val="10"/>
     <w:qFormat/>
-    <w:rsid w:val="00240C5B"/>
+    <w:rsid w:val="004639B2"/>
     <w:pPr>
       <w:contextualSpacing/>
       <w:jc w:val="center"/>
@@ -18654,7 +18823,7 @@
     <w:basedOn w:val="a0"/>
     <w:link w:val="a3"/>
     <w:uiPriority w:val="10"/>
-    <w:rsid w:val="00240C5B"/>
+    <w:rsid w:val="004639B2"/>
     <w:rPr>
       <w:rFonts w:asciiTheme="majorHAnsi" w:eastAsiaTheme="majorEastAsia" w:hAnsiTheme="majorHAnsi" w:cstheme="majorBidi"/>
       <w:spacing w:val="-10"/>
@@ -18670,7 +18839,7 @@
     <w:link w:val="a6"/>
     <w:uiPriority w:val="11"/>
     <w:qFormat/>
-    <w:rsid w:val="00240C5B"/>
+    <w:rsid w:val="004639B2"/>
     <w:pPr>
       <w:numPr>
         <w:ilvl w:val="1"/>
@@ -18691,7 +18860,7 @@
     <w:basedOn w:val="a0"/>
     <w:link w:val="a5"/>
     <w:uiPriority w:val="11"/>
-    <w:rsid w:val="00240C5B"/>
+    <w:rsid w:val="004639B2"/>
     <w:rPr>
       <w:rFonts w:asciiTheme="majorHAnsi" w:eastAsiaTheme="majorEastAsia" w:hAnsiTheme="majorHAnsi" w:cstheme="majorBidi"/>
       <w:color w:val="595959" w:themeColor="text1" w:themeTint="A6"/>
@@ -18707,7 +18876,7 @@
     <w:link w:val="a8"/>
     <w:uiPriority w:val="29"/>
     <w:qFormat/>
-    <w:rsid w:val="00240C5B"/>
+    <w:rsid w:val="004639B2"/>
     <w:pPr>
       <w:spacing w:before="160" w:after="160"/>
       <w:jc w:val="center"/>
@@ -18723,7 +18892,7 @@
     <w:basedOn w:val="a0"/>
     <w:link w:val="a7"/>
     <w:uiPriority w:val="29"/>
-    <w:rsid w:val="00240C5B"/>
+    <w:rsid w:val="004639B2"/>
     <w:rPr>
       <w:i/>
       <w:iCs/>
@@ -18735,7 +18904,7 @@
     <w:basedOn w:val="a"/>
     <w:uiPriority w:val="34"/>
     <w:qFormat/>
-    <w:rsid w:val="00240C5B"/>
+    <w:rsid w:val="004639B2"/>
     <w:pPr>
       <w:ind w:left="720"/>
       <w:contextualSpacing/>
@@ -18746,7 +18915,7 @@
     <w:basedOn w:val="a0"/>
     <w:uiPriority w:val="21"/>
     <w:qFormat/>
-    <w:rsid w:val="00240C5B"/>
+    <w:rsid w:val="004639B2"/>
     <w:rPr>
       <w:i/>
       <w:iCs/>
@@ -18760,7 +18929,7 @@
     <w:link w:val="ac"/>
     <w:uiPriority w:val="30"/>
     <w:qFormat/>
-    <w:rsid w:val="00240C5B"/>
+    <w:rsid w:val="004639B2"/>
     <w:pPr>
       <w:pBdr>
         <w:top w:val="single" w:sz="4" w:space="10" w:color="2F5496" w:themeColor="accent1" w:themeShade="BF"/>
@@ -18781,7 +18950,7 @@
     <w:basedOn w:val="a0"/>
     <w:link w:val="ab"/>
     <w:uiPriority w:val="30"/>
-    <w:rsid w:val="00240C5B"/>
+    <w:rsid w:val="004639B2"/>
     <w:rPr>
       <w:i/>
       <w:iCs/>
@@ -18793,7 +18962,7 @@
     <w:basedOn w:val="a0"/>
     <w:uiPriority w:val="32"/>
     <w:qFormat/>
-    <w:rsid w:val="00240C5B"/>
+    <w:rsid w:val="004639B2"/>
     <w:rPr>
       <w:b/>
       <w:bCs/>
@@ -18802,13 +18971,36 @@
       <w:spacing w:val="5"/>
     </w:rPr>
   </w:style>
-  <w:style w:type="paragraph" w:styleId="ae">
+  <w:style w:type="character" w:styleId="ae">
+    <w:name w:val="Hyperlink"/>
+    <w:basedOn w:val="a0"/>
+    <w:uiPriority w:val="99"/>
+    <w:unhideWhenUsed/>
+    <w:rsid w:val="004639B2"/>
+    <w:rPr>
+      <w:color w:val="0563C1" w:themeColor="hyperlink"/>
+      <w:u w:val="single"/>
+    </w:rPr>
+  </w:style>
+  <w:style w:type="character" w:styleId="af">
+    <w:name w:val="Unresolved Mention"/>
+    <w:basedOn w:val="a0"/>
+    <w:uiPriority w:val="99"/>
+    <w:semiHidden/>
+    <w:unhideWhenUsed/>
+    <w:rsid w:val="004639B2"/>
+    <w:rPr>
+      <w:color w:val="605E5C"/>
+      <w:shd w:val="clear" w:color="auto" w:fill="E1DFDD"/>
+    </w:rPr>
+  </w:style>
+  <w:style w:type="paragraph" w:styleId="af0">
     <w:name w:val="header"/>
     <w:basedOn w:val="a"/>
-    <w:link w:val="af"/>
+    <w:link w:val="af1"/>
     <w:uiPriority w:val="99"/>
     <w:unhideWhenUsed/>
-    <w:rsid w:val="00240C5B"/>
+    <w:rsid w:val="004639B2"/>
     <w:pPr>
       <w:tabs>
         <w:tab w:val="center" w:pos="4153"/>
@@ -18823,12 +19015,12 @@
       <w:szCs w:val="18"/>
     </w:rPr>
   </w:style>
-  <w:style w:type="character" w:customStyle="1" w:styleId="af">
+  <w:style w:type="character" w:customStyle="1" w:styleId="af1">
     <w:name w:val="页眉 字符"/>
     <w:basedOn w:val="a0"/>
-    <w:link w:val="ae"/>
+    <w:link w:val="af0"/>
     <w:uiPriority w:val="99"/>
-    <w:rsid w:val="00240C5B"/>
+    <w:rsid w:val="004639B2"/>
     <w:rPr>
       <w:rFonts w:ascii="Times New Roman" w:eastAsia="宋体"/>
       <w:color w:val="1E2630"/>
@@ -18836,13 +19028,13 @@
       <w:szCs w:val="18"/>
     </w:rPr>
   </w:style>
-  <w:style w:type="paragraph" w:styleId="af0">
+  <w:style w:type="paragraph" w:styleId="af2">
     <w:name w:val="footer"/>
     <w:basedOn w:val="a"/>
-    <w:link w:val="af1"/>
+    <w:link w:val="af3"/>
     <w:uiPriority w:val="99"/>
     <w:unhideWhenUsed/>
-    <w:rsid w:val="00240C5B"/>
+    <w:rsid w:val="004639B2"/>
     <w:pPr>
       <w:tabs>
         <w:tab w:val="center" w:pos="4153"/>
@@ -18857,12 +19049,12 @@
       <w:szCs w:val="18"/>
     </w:rPr>
   </w:style>
-  <w:style w:type="character" w:customStyle="1" w:styleId="af1">
+  <w:style w:type="character" w:customStyle="1" w:styleId="af3">
     <w:name w:val="页脚 字符"/>
     <w:basedOn w:val="a0"/>
-    <w:link w:val="af0"/>
+    <w:link w:val="af2"/>
     <w:uiPriority w:val="99"/>
-    <w:rsid w:val="00240C5B"/>
+    <w:rsid w:val="004639B2"/>
     <w:rPr>
       <w:rFonts w:ascii="Times New Roman" w:eastAsia="宋体"/>
       <w:color w:val="1E2630"/>
@@ -18877,7 +19069,7 @@
     <w:autoRedefine/>
     <w:uiPriority w:val="39"/>
     <w:unhideWhenUsed/>
-    <w:rsid w:val="00240C5B"/>
+    <w:rsid w:val="004639B2"/>
   </w:style>
   <w:style w:type="paragraph" w:styleId="TOC2">
     <w:name w:val="toc 2"/>
@@ -18886,7 +19078,7 @@
     <w:autoRedefine/>
     <w:uiPriority w:val="39"/>
     <w:unhideWhenUsed/>
-    <w:rsid w:val="00240C5B"/>
+    <w:rsid w:val="004639B2"/>
     <w:pPr>
       <w:ind w:leftChars="200" w:left="420"/>
     </w:pPr>

</xml_diff>

<commit_message>
Lecture 2 v95: data-type samples + visualisation scripts; venue -> Nan 209
</commit_message>
<xml_diff>
--- a/files/Syllabus-Big-Data-Analytics-2026.docx
+++ b/files/Syllabus-Big-Data-Analytics-2026.docx
@@ -238,7 +238,7 @@
         <w:rPr>
           <w:noProof/>
         </w:rPr>
-        <w:instrText>PAGEREF _Toc240561315 \h</w:instrText>
+        <w:instrText>PAGEREF _Toc241088448 \h</w:instrText>
       </w:r>
       <w:r>
         <w:rPr>
@@ -325,7 +325,7 @@
         <w:rPr>
           <w:noProof/>
         </w:rPr>
-        <w:instrText>PAGEREF _Toc240561316 \h</w:instrText>
+        <w:instrText>PAGEREF _Toc241088449 \h</w:instrText>
       </w:r>
       <w:r>
         <w:rPr>
@@ -412,7 +412,7 @@
         <w:rPr>
           <w:noProof/>
         </w:rPr>
-        <w:instrText>PAGEREF _Toc240561317 \h</w:instrText>
+        <w:instrText>PAGEREF _Toc241088450 \h</w:instrText>
       </w:r>
       <w:r>
         <w:rPr>
@@ -534,7 +534,7 @@
         <w:rPr>
           <w:noProof/>
         </w:rPr>
-        <w:instrText>PAGEREF _Toc240561318 \h</w:instrText>
+        <w:instrText>PAGEREF _Toc241088451 \h</w:instrText>
       </w:r>
       <w:r>
         <w:rPr>
@@ -621,7 +621,7 @@
         <w:rPr>
           <w:noProof/>
         </w:rPr>
-        <w:instrText>PAGEREF _Toc240561319 \h</w:instrText>
+        <w:instrText>PAGEREF _Toc241088452 \h</w:instrText>
       </w:r>
       <w:r>
         <w:rPr>
@@ -736,7 +736,7 @@
         <w:rPr>
           <w:noProof/>
         </w:rPr>
-        <w:instrText>PAGEREF _Toc240561320 \h</w:instrText>
+        <w:instrText>PAGEREF _Toc241088453 \h</w:instrText>
       </w:r>
       <w:r>
         <w:rPr>
@@ -830,7 +830,7 @@
         <w:rPr>
           <w:noProof/>
         </w:rPr>
-        <w:instrText>PAGEREF _Toc240561321 \h</w:instrText>
+        <w:instrText>PAGEREF _Toc241088454 \h</w:instrText>
       </w:r>
       <w:r>
         <w:rPr>
@@ -931,7 +931,7 @@
         <w:rPr>
           <w:noProof/>
         </w:rPr>
-        <w:instrText>PAGEREF _Toc240561322 \h</w:instrText>
+        <w:instrText>PAGEREF _Toc241088455 \h</w:instrText>
       </w:r>
       <w:r>
         <w:rPr>
@@ -1025,7 +1025,7 @@
         <w:rPr>
           <w:noProof/>
         </w:rPr>
-        <w:instrText>PAGEREF _Toc240561323 \h</w:instrText>
+        <w:instrText>PAGEREF _Toc241088456 \h</w:instrText>
       </w:r>
       <w:r>
         <w:rPr>
@@ -1119,7 +1119,7 @@
         <w:rPr>
           <w:noProof/>
         </w:rPr>
-        <w:instrText>PAGEREF _Toc240561324 \h</w:instrText>
+        <w:instrText>PAGEREF _Toc241088457 \h</w:instrText>
       </w:r>
       <w:r>
         <w:rPr>
@@ -1213,7 +1213,7 @@
         <w:rPr>
           <w:noProof/>
         </w:rPr>
-        <w:instrText>PAGEREF _Toc240561325 \h</w:instrText>
+        <w:instrText>PAGEREF _Toc241088458 \h</w:instrText>
       </w:r>
       <w:r>
         <w:rPr>
@@ -1307,7 +1307,7 @@
         <w:rPr>
           <w:noProof/>
         </w:rPr>
-        <w:instrText>PAGEREF _Toc240561326 \h</w:instrText>
+        <w:instrText>PAGEREF _Toc241088459 \h</w:instrText>
       </w:r>
       <w:r>
         <w:rPr>
@@ -1401,7 +1401,7 @@
         <w:rPr>
           <w:noProof/>
         </w:rPr>
-        <w:instrText>PAGEREF _Toc240561327 \h</w:instrText>
+        <w:instrText>PAGEREF _Toc241088460 \h</w:instrText>
       </w:r>
       <w:r>
         <w:rPr>
@@ -1495,7 +1495,7 @@
         <w:rPr>
           <w:noProof/>
         </w:rPr>
-        <w:instrText>PAGEREF _Toc240561328 \h</w:instrText>
+        <w:instrText>PAGEREF _Toc241088461 \h</w:instrText>
       </w:r>
       <w:r>
         <w:rPr>
@@ -1589,7 +1589,7 @@
         <w:rPr>
           <w:noProof/>
         </w:rPr>
-        <w:instrText>PAGEREF _Toc240561329 \h</w:instrText>
+        <w:instrText>PAGEREF _Toc241088462 \h</w:instrText>
       </w:r>
       <w:r>
         <w:rPr>
@@ -1683,7 +1683,7 @@
         <w:rPr>
           <w:noProof/>
         </w:rPr>
-        <w:instrText>PAGEREF _Toc240561330 \h</w:instrText>
+        <w:instrText>PAGEREF _Toc241088463 \h</w:instrText>
       </w:r>
       <w:r>
         <w:rPr>
@@ -1777,7 +1777,7 @@
         <w:rPr>
           <w:noProof/>
         </w:rPr>
-        <w:instrText>PAGEREF _Toc240561331 \h</w:instrText>
+        <w:instrText>PAGEREF _Toc241088464 \h</w:instrText>
       </w:r>
       <w:r>
         <w:rPr>
@@ -1871,7 +1871,7 @@
         <w:rPr>
           <w:noProof/>
         </w:rPr>
-        <w:instrText>PAGEREF _Toc240561332 \h</w:instrText>
+        <w:instrText>PAGEREF _Toc241088465 \h</w:instrText>
       </w:r>
       <w:r>
         <w:rPr>
@@ -1965,7 +1965,7 @@
         <w:rPr>
           <w:noProof/>
         </w:rPr>
-        <w:instrText>PAGEREF _Toc240561333 \h</w:instrText>
+        <w:instrText>PAGEREF _Toc241088466 \h</w:instrText>
       </w:r>
       <w:r>
         <w:rPr>
@@ -2059,7 +2059,7 @@
         <w:rPr>
           <w:noProof/>
         </w:rPr>
-        <w:instrText>PAGEREF _Toc240561334 \h</w:instrText>
+        <w:instrText>PAGEREF _Toc241088467 \h</w:instrText>
       </w:r>
       <w:r>
         <w:rPr>
@@ -2146,7 +2146,7 @@
         <w:rPr>
           <w:noProof/>
         </w:rPr>
-        <w:instrText>PAGEREF _Toc240561335 \h</w:instrText>
+        <w:instrText>PAGEREF _Toc241088468 \h</w:instrText>
       </w:r>
       <w:r>
         <w:rPr>
@@ -2254,7 +2254,7 @@
         <w:rPr>
           <w:noProof/>
         </w:rPr>
-        <w:instrText>PAGEREF _Toc240561336 \h</w:instrText>
+        <w:instrText>PAGEREF _Toc241088469 \h</w:instrText>
       </w:r>
       <w:r>
         <w:rPr>
@@ -2341,7 +2341,7 @@
         <w:rPr>
           <w:noProof/>
         </w:rPr>
-        <w:instrText>PAGEREF _Toc240561337 \h</w:instrText>
+        <w:instrText>PAGEREF _Toc241088470 \h</w:instrText>
       </w:r>
       <w:r>
         <w:rPr>
@@ -2442,7 +2442,7 @@
         <w:rPr>
           <w:noProof/>
         </w:rPr>
-        <w:instrText>PAGEREF _Toc240561338 \h</w:instrText>
+        <w:instrText>PAGEREF _Toc241088471 \h</w:instrText>
       </w:r>
       <w:r>
         <w:rPr>
@@ -2543,7 +2543,7 @@
         <w:rPr>
           <w:noProof/>
         </w:rPr>
-        <w:instrText>PAGEREF _Toc240561339 \h</w:instrText>
+        <w:instrText>PAGEREF _Toc241088472 \h</w:instrText>
       </w:r>
       <w:r>
         <w:rPr>
@@ -2644,7 +2644,7 @@
         <w:rPr>
           <w:noProof/>
         </w:rPr>
-        <w:instrText>PAGEREF _Toc240561340 \h</w:instrText>
+        <w:instrText>PAGEREF _Toc241088473 \h</w:instrText>
       </w:r>
       <w:r>
         <w:rPr>
@@ -2731,7 +2731,7 @@
         <w:rPr>
           <w:noProof/>
         </w:rPr>
-        <w:instrText>PAGEREF _Toc240561341 \h</w:instrText>
+        <w:instrText>PAGEREF _Toc241088474 \h</w:instrText>
       </w:r>
       <w:r>
         <w:rPr>
@@ -2819,7 +2819,7 @@
         <w:rPr>
           <w:noProof/>
         </w:rPr>
-        <w:instrText>PAGEREF _Toc240561342 \h</w:instrText>
+        <w:instrText>PAGEREF _Toc241088475 \h</w:instrText>
       </w:r>
       <w:r>
         <w:rPr>
@@ -2906,7 +2906,7 @@
         <w:rPr>
           <w:noProof/>
         </w:rPr>
-        <w:instrText>PAGEREF _Toc240561343 \h</w:instrText>
+        <w:instrText>PAGEREF _Toc241088476 \h</w:instrText>
       </w:r>
       <w:r>
         <w:rPr>
@@ -2993,7 +2993,7 @@
         <w:rPr>
           <w:noProof/>
         </w:rPr>
-        <w:instrText>PAGEREF _Toc240561344 \h</w:instrText>
+        <w:instrText>PAGEREF _Toc241088477 \h</w:instrText>
       </w:r>
       <w:r>
         <w:rPr>
@@ -3080,7 +3080,7 @@
         <w:rPr>
           <w:noProof/>
         </w:rPr>
-        <w:instrText>PAGEREF _Toc240561345 \h</w:instrText>
+        <w:instrText>PAGEREF _Toc241088478 \h</w:instrText>
       </w:r>
       <w:r>
         <w:rPr>
@@ -3167,7 +3167,7 @@
         <w:rPr>
           <w:noProof/>
         </w:rPr>
-        <w:instrText>PAGEREF _Toc240561346 \h</w:instrText>
+        <w:instrText>PAGEREF _Toc241088479 \h</w:instrText>
       </w:r>
       <w:r>
         <w:rPr>
@@ -3268,7 +3268,7 @@
         <w:rPr>
           <w:noProof/>
         </w:rPr>
-        <w:instrText>PAGEREF _Toc240561347 \h</w:instrText>
+        <w:instrText>PAGEREF _Toc241088480 \h</w:instrText>
       </w:r>
       <w:r>
         <w:rPr>
@@ -3318,7 +3318,7 @@
         </w:rPr>
         <w:fldChar w:fldCharType="end"/>
       </w:r>
-      <w:bookmarkStart w:id="0" w:name="_Toc240561315"/>
+      <w:bookmarkStart w:id="0" w:name="_Toc241088448"/>
       <w:r>
         <w:rPr>
           <w:rFonts w:hint="eastAsia"/>
@@ -4167,14 +4167,14 @@
                 <w:rFonts w:hint="eastAsia"/>
                 <w:sz w:val="19"/>
               </w:rPr>
-              <w:t>四方楼南</w:t>
-            </w:r>
-            <w:r>
-              <w:rPr>
-                <w:rFonts w:hint="eastAsia"/>
-                <w:sz w:val="19"/>
-              </w:rPr>
-              <w:t xml:space="preserve"> 106</w:t>
+              <w:t>南</w:t>
+            </w:r>
+            <w:r>
+              <w:rPr>
+                <w:rFonts w:hint="eastAsia"/>
+                <w:sz w:val="19"/>
+              </w:rPr>
+              <w:t xml:space="preserve"> 209</w:t>
             </w:r>
           </w:p>
         </w:tc>
@@ -4627,7 +4627,7 @@
           <w:rFonts w:hint="eastAsia"/>
         </w:rPr>
       </w:pPr>
-      <w:bookmarkStart w:id="1" w:name="_Toc240561316"/>
+      <w:bookmarkStart w:id="1" w:name="_Toc241088449"/>
       <w:r>
         <w:rPr>
           <w:rFonts w:hint="eastAsia"/>
@@ -4802,7 +4802,7 @@
           <w:rFonts w:hint="eastAsia"/>
         </w:rPr>
       </w:pPr>
-      <w:bookmarkStart w:id="2" w:name="_Toc240561317"/>
+      <w:bookmarkStart w:id="2" w:name="_Toc241088450"/>
       <w:r>
         <w:rPr>
           <w:rFonts w:hint="eastAsia"/>
@@ -5078,7 +5078,7 @@
           <w:rFonts w:hint="eastAsia"/>
         </w:rPr>
       </w:pPr>
-      <w:bookmarkStart w:id="3" w:name="_Toc240561318"/>
+      <w:bookmarkStart w:id="3" w:name="_Toc241088451"/>
       <w:r>
         <w:rPr>
           <w:rFonts w:hint="eastAsia"/>
@@ -9336,7 +9336,7 @@
           <w:rFonts w:hint="eastAsia"/>
         </w:rPr>
       </w:pPr>
-      <w:bookmarkStart w:id="4" w:name="_Toc240561319"/>
+      <w:bookmarkStart w:id="4" w:name="_Toc241088452"/>
       <w:r>
         <w:rPr>
           <w:rFonts w:hint="eastAsia"/>
@@ -9358,7 +9358,7 @@
           <w:rFonts w:hint="eastAsia"/>
         </w:rPr>
       </w:pPr>
-      <w:bookmarkStart w:id="5" w:name="_Toc240561320"/>
+      <w:bookmarkStart w:id="5" w:name="_Toc241088453"/>
       <w:r>
         <w:rPr>
           <w:rFonts w:hint="eastAsia"/>
@@ -9708,7 +9708,7 @@
           <w:rFonts w:hint="eastAsia"/>
         </w:rPr>
       </w:pPr>
-      <w:bookmarkStart w:id="6" w:name="_Toc240561321"/>
+      <w:bookmarkStart w:id="6" w:name="_Toc241088454"/>
       <w:r>
         <w:rPr>
           <w:rFonts w:hint="eastAsia"/>
@@ -9997,7 +9997,7 @@
           <w:rFonts w:hint="eastAsia"/>
         </w:rPr>
       </w:pPr>
-      <w:bookmarkStart w:id="7" w:name="_Toc240561322"/>
+      <w:bookmarkStart w:id="7" w:name="_Toc241088455"/>
       <w:r>
         <w:rPr>
           <w:rFonts w:hint="eastAsia"/>
@@ -10256,7 +10256,7 @@
           <w:rFonts w:hint="eastAsia"/>
         </w:rPr>
       </w:pPr>
-      <w:bookmarkStart w:id="8" w:name="_Toc240561323"/>
+      <w:bookmarkStart w:id="8" w:name="_Toc241088456"/>
       <w:r>
         <w:rPr>
           <w:rFonts w:hint="eastAsia"/>
@@ -10509,7 +10509,7 @@
           <w:rFonts w:hint="eastAsia"/>
         </w:rPr>
       </w:pPr>
-      <w:bookmarkStart w:id="9" w:name="_Toc240561324"/>
+      <w:bookmarkStart w:id="9" w:name="_Toc241088457"/>
       <w:r>
         <w:rPr>
           <w:rFonts w:hint="eastAsia"/>
@@ -10726,7 +10726,7 @@
           <w:rFonts w:hint="eastAsia"/>
         </w:rPr>
       </w:pPr>
-      <w:bookmarkStart w:id="10" w:name="_Toc240561325"/>
+      <w:bookmarkStart w:id="10" w:name="_Toc241088458"/>
       <w:r>
         <w:rPr>
           <w:rFonts w:hint="eastAsia"/>
@@ -10946,7 +10946,7 @@
           <w:rFonts w:hint="eastAsia"/>
         </w:rPr>
       </w:pPr>
-      <w:bookmarkStart w:id="11" w:name="_Toc240561326"/>
+      <w:bookmarkStart w:id="11" w:name="_Toc241088459"/>
       <w:r>
         <w:rPr>
           <w:rFonts w:hint="eastAsia"/>
@@ -11260,7 +11260,7 @@
           <w:rFonts w:hint="eastAsia"/>
         </w:rPr>
       </w:pPr>
-      <w:bookmarkStart w:id="12" w:name="_Toc240561327"/>
+      <w:bookmarkStart w:id="12" w:name="_Toc241088460"/>
       <w:r>
         <w:rPr>
           <w:rFonts w:hint="eastAsia"/>
@@ -11537,7 +11537,7 @@
           <w:rFonts w:hint="eastAsia"/>
         </w:rPr>
       </w:pPr>
-      <w:bookmarkStart w:id="13" w:name="_Toc240561328"/>
+      <w:bookmarkStart w:id="13" w:name="_Toc241088461"/>
       <w:r>
         <w:rPr>
           <w:rFonts w:hint="eastAsia"/>
@@ -11802,7 +11802,7 @@
           <w:rFonts w:hint="eastAsia"/>
         </w:rPr>
       </w:pPr>
-      <w:bookmarkStart w:id="14" w:name="_Toc240561329"/>
+      <w:bookmarkStart w:id="14" w:name="_Toc241088462"/>
       <w:r>
         <w:rPr>
           <w:rFonts w:hint="eastAsia"/>
@@ -12151,7 +12151,7 @@
           <w:rFonts w:hint="eastAsia"/>
         </w:rPr>
       </w:pPr>
-      <w:bookmarkStart w:id="15" w:name="_Toc240561330"/>
+      <w:bookmarkStart w:id="15" w:name="_Toc241088463"/>
       <w:r>
         <w:rPr>
           <w:rFonts w:hint="eastAsia"/>
@@ -12512,7 +12512,7 @@
           <w:rFonts w:hint="eastAsia"/>
         </w:rPr>
       </w:pPr>
-      <w:bookmarkStart w:id="16" w:name="_Toc240561331"/>
+      <w:bookmarkStart w:id="16" w:name="_Toc241088464"/>
       <w:r>
         <w:rPr>
           <w:rFonts w:hint="eastAsia"/>
@@ -12802,7 +12802,7 @@
           <w:rFonts w:hint="eastAsia"/>
         </w:rPr>
       </w:pPr>
-      <w:bookmarkStart w:id="17" w:name="_Toc240561332"/>
+      <w:bookmarkStart w:id="17" w:name="_Toc241088465"/>
       <w:r>
         <w:rPr>
           <w:rFonts w:hint="eastAsia"/>
@@ -13127,7 +13127,7 @@
           <w:rFonts w:hint="eastAsia"/>
         </w:rPr>
       </w:pPr>
-      <w:bookmarkStart w:id="18" w:name="_Toc240561333"/>
+      <w:bookmarkStart w:id="18" w:name="_Toc241088466"/>
       <w:r>
         <w:rPr>
           <w:rFonts w:hint="eastAsia"/>
@@ -13416,7 +13416,7 @@
           <w:rFonts w:hint="eastAsia"/>
         </w:rPr>
       </w:pPr>
-      <w:bookmarkStart w:id="19" w:name="_Toc240561334"/>
+      <w:bookmarkStart w:id="19" w:name="_Toc241088467"/>
       <w:r>
         <w:rPr>
           <w:rFonts w:hint="eastAsia"/>
@@ -13693,7 +13693,7 @@
           <w:rFonts w:hint="eastAsia"/>
         </w:rPr>
       </w:pPr>
-      <w:bookmarkStart w:id="20" w:name="_Toc240561335"/>
+      <w:bookmarkStart w:id="20" w:name="_Toc241088468"/>
       <w:r>
         <w:rPr>
           <w:rFonts w:hint="eastAsia"/>
@@ -14497,7 +14497,7 @@
           <w:rFonts w:hint="eastAsia"/>
         </w:rPr>
       </w:pPr>
-      <w:bookmarkStart w:id="21" w:name="_Toc240561336"/>
+      <w:bookmarkStart w:id="21" w:name="_Toc241088469"/>
       <w:r>
         <w:rPr>
           <w:rFonts w:hint="eastAsia"/>
@@ -15124,7 +15124,7 @@
           <w:rFonts w:hint="eastAsia"/>
         </w:rPr>
       </w:pPr>
-      <w:bookmarkStart w:id="22" w:name="_Toc240561337"/>
+      <w:bookmarkStart w:id="22" w:name="_Toc241088470"/>
       <w:r>
         <w:rPr>
           <w:rFonts w:hint="eastAsia"/>
@@ -15146,7 +15146,7 @@
           <w:rFonts w:hint="eastAsia"/>
         </w:rPr>
       </w:pPr>
-      <w:bookmarkStart w:id="23" w:name="_Toc240561338"/>
+      <w:bookmarkStart w:id="23" w:name="_Toc241088471"/>
       <w:r>
         <w:rPr>
           <w:rFonts w:hint="eastAsia"/>
@@ -15207,7 +15207,7 @@
           <w:rFonts w:hint="eastAsia"/>
         </w:rPr>
       </w:pPr>
-      <w:bookmarkStart w:id="24" w:name="_Toc240561339"/>
+      <w:bookmarkStart w:id="24" w:name="_Toc241088472"/>
       <w:r>
         <w:rPr>
           <w:rFonts w:hint="eastAsia"/>
@@ -15292,7 +15292,7 @@
           <w:rFonts w:hint="eastAsia"/>
         </w:rPr>
       </w:pPr>
-      <w:bookmarkStart w:id="25" w:name="_Toc240561340"/>
+      <w:bookmarkStart w:id="25" w:name="_Toc241088473"/>
       <w:r>
         <w:rPr>
           <w:rFonts w:hint="eastAsia"/>
@@ -15398,7 +15398,7 @@
           <w:rFonts w:hint="eastAsia"/>
         </w:rPr>
       </w:pPr>
-      <w:bookmarkStart w:id="26" w:name="_Toc240561341"/>
+      <w:bookmarkStart w:id="26" w:name="_Toc241088474"/>
       <w:r>
         <w:rPr>
           <w:rFonts w:hint="eastAsia"/>
@@ -16365,7 +16365,7 @@
           <w:rFonts w:hint="eastAsia"/>
         </w:rPr>
       </w:pPr>
-      <w:bookmarkStart w:id="27" w:name="_Toc240561342"/>
+      <w:bookmarkStart w:id="27" w:name="_Toc241088475"/>
       <w:r>
         <w:rPr>
           <w:rFonts w:hint="eastAsia"/>
@@ -16387,7 +16387,7 @@
           <w:rFonts w:hint="eastAsia"/>
         </w:rPr>
       </w:pPr>
-      <w:bookmarkStart w:id="28" w:name="_Toc240561343"/>
+      <w:bookmarkStart w:id="28" w:name="_Toc241088476"/>
       <w:r>
         <w:rPr>
           <w:rFonts w:hint="eastAsia"/>
@@ -16436,7 +16436,7 @@
           <w:rFonts w:hint="eastAsia"/>
         </w:rPr>
       </w:pPr>
-      <w:bookmarkStart w:id="29" w:name="_Toc240561344"/>
+      <w:bookmarkStart w:id="29" w:name="_Toc241088477"/>
       <w:r>
         <w:rPr>
           <w:rFonts w:hint="eastAsia"/>
@@ -16813,7 +16813,7 @@
           <w:rFonts w:hint="eastAsia"/>
         </w:rPr>
       </w:pPr>
-      <w:bookmarkStart w:id="30" w:name="_Toc240561345"/>
+      <w:bookmarkStart w:id="30" w:name="_Toc241088478"/>
       <w:r>
         <w:rPr>
           <w:rFonts w:hint="eastAsia"/>
@@ -17087,7 +17087,7 @@
           <w:rFonts w:hint="eastAsia"/>
         </w:rPr>
       </w:pPr>
-      <w:bookmarkStart w:id="31" w:name="_Toc240561346"/>
+      <w:bookmarkStart w:id="31" w:name="_Toc241088479"/>
       <w:r>
         <w:rPr>
           <w:rFonts w:hint="eastAsia"/>
@@ -17439,7 +17439,7 @@
           <w:rFonts w:hint="eastAsia"/>
         </w:rPr>
       </w:pPr>
-      <w:bookmarkStart w:id="32" w:name="_Toc240561347"/>
+      <w:bookmarkStart w:id="32" w:name="_Toc241088480"/>
       <w:r>
         <w:rPr>
           <w:rFonts w:hint="eastAsia"/>
@@ -18457,7 +18457,7 @@
     <w:link w:val="10"/>
     <w:uiPriority w:val="9"/>
     <w:qFormat/>
-    <w:rsid w:val="004639B2"/>
+    <w:rsid w:val="00616878"/>
     <w:pPr>
       <w:keepNext/>
       <w:keepLines/>
@@ -18480,7 +18480,7 @@
     <w:uiPriority w:val="9"/>
     <w:unhideWhenUsed/>
     <w:qFormat/>
-    <w:rsid w:val="004639B2"/>
+    <w:rsid w:val="00616878"/>
     <w:pPr>
       <w:keepNext/>
       <w:keepLines/>
@@ -18503,7 +18503,7 @@
     <w:semiHidden/>
     <w:unhideWhenUsed/>
     <w:qFormat/>
-    <w:rsid w:val="004639B2"/>
+    <w:rsid w:val="00616878"/>
     <w:pPr>
       <w:keepNext/>
       <w:keepLines/>
@@ -18526,7 +18526,7 @@
     <w:semiHidden/>
     <w:unhideWhenUsed/>
     <w:qFormat/>
-    <w:rsid w:val="004639B2"/>
+    <w:rsid w:val="00616878"/>
     <w:pPr>
       <w:keepNext/>
       <w:keepLines/>
@@ -18549,7 +18549,7 @@
     <w:semiHidden/>
     <w:unhideWhenUsed/>
     <w:qFormat/>
-    <w:rsid w:val="004639B2"/>
+    <w:rsid w:val="00616878"/>
     <w:pPr>
       <w:keepNext/>
       <w:keepLines/>
@@ -18572,7 +18572,7 @@
     <w:semiHidden/>
     <w:unhideWhenUsed/>
     <w:qFormat/>
-    <w:rsid w:val="004639B2"/>
+    <w:rsid w:val="00616878"/>
     <w:pPr>
       <w:keepNext/>
       <w:keepLines/>
@@ -18595,7 +18595,7 @@
     <w:semiHidden/>
     <w:unhideWhenUsed/>
     <w:qFormat/>
-    <w:rsid w:val="004639B2"/>
+    <w:rsid w:val="00616878"/>
     <w:pPr>
       <w:keepNext/>
       <w:keepLines/>
@@ -18618,7 +18618,7 @@
     <w:semiHidden/>
     <w:unhideWhenUsed/>
     <w:qFormat/>
-    <w:rsid w:val="004639B2"/>
+    <w:rsid w:val="00616878"/>
     <w:pPr>
       <w:keepNext/>
       <w:keepLines/>
@@ -18638,7 +18638,7 @@
     <w:semiHidden/>
     <w:unhideWhenUsed/>
     <w:qFormat/>
-    <w:rsid w:val="004639B2"/>
+    <w:rsid w:val="00616878"/>
     <w:pPr>
       <w:keepNext/>
       <w:keepLines/>
@@ -18681,7 +18681,7 @@
     <w:basedOn w:val="a0"/>
     <w:link w:val="1"/>
     <w:uiPriority w:val="9"/>
-    <w:rsid w:val="004639B2"/>
+    <w:rsid w:val="00616878"/>
     <w:rPr>
       <w:rFonts w:ascii="Arial" w:eastAsia="微软雅黑" w:hAnsiTheme="majorHAnsi" w:cstheme="majorBidi"/>
       <w:b/>
@@ -18695,7 +18695,7 @@
     <w:basedOn w:val="a0"/>
     <w:link w:val="2"/>
     <w:uiPriority w:val="9"/>
-    <w:rsid w:val="004639B2"/>
+    <w:rsid w:val="00616878"/>
     <w:rPr>
       <w:rFonts w:ascii="Arial" w:eastAsia="微软雅黑" w:hAnsiTheme="majorHAnsi" w:cstheme="majorBidi"/>
       <w:b/>
@@ -18710,7 +18710,7 @@
     <w:link w:val="3"/>
     <w:uiPriority w:val="9"/>
     <w:semiHidden/>
-    <w:rsid w:val="004639B2"/>
+    <w:rsid w:val="00616878"/>
     <w:rPr>
       <w:rFonts w:asciiTheme="majorHAnsi" w:eastAsiaTheme="majorEastAsia" w:hAnsiTheme="majorHAnsi" w:cstheme="majorBidi"/>
       <w:color w:val="2F5496" w:themeColor="accent1" w:themeShade="BF"/>
@@ -18724,7 +18724,7 @@
     <w:link w:val="4"/>
     <w:uiPriority w:val="9"/>
     <w:semiHidden/>
-    <w:rsid w:val="004639B2"/>
+    <w:rsid w:val="00616878"/>
     <w:rPr>
       <w:rFonts w:cstheme="majorBidi"/>
       <w:color w:val="2F5496" w:themeColor="accent1" w:themeShade="BF"/>
@@ -18738,7 +18738,7 @@
     <w:link w:val="5"/>
     <w:uiPriority w:val="9"/>
     <w:semiHidden/>
-    <w:rsid w:val="004639B2"/>
+    <w:rsid w:val="00616878"/>
     <w:rPr>
       <w:rFonts w:cstheme="majorBidi"/>
       <w:color w:val="2F5496" w:themeColor="accent1" w:themeShade="BF"/>
@@ -18752,7 +18752,7 @@
     <w:link w:val="6"/>
     <w:uiPriority w:val="9"/>
     <w:semiHidden/>
-    <w:rsid w:val="004639B2"/>
+    <w:rsid w:val="00616878"/>
     <w:rPr>
       <w:rFonts w:cstheme="majorBidi"/>
       <w:b/>
@@ -18766,7 +18766,7 @@
     <w:link w:val="7"/>
     <w:uiPriority w:val="9"/>
     <w:semiHidden/>
-    <w:rsid w:val="004639B2"/>
+    <w:rsid w:val="00616878"/>
     <w:rPr>
       <w:rFonts w:cstheme="majorBidi"/>
       <w:b/>
@@ -18780,7 +18780,7 @@
     <w:link w:val="8"/>
     <w:uiPriority w:val="9"/>
     <w:semiHidden/>
-    <w:rsid w:val="004639B2"/>
+    <w:rsid w:val="00616878"/>
     <w:rPr>
       <w:rFonts w:cstheme="majorBidi"/>
       <w:color w:val="595959" w:themeColor="text1" w:themeTint="A6"/>
@@ -18792,7 +18792,7 @@
     <w:link w:val="9"/>
     <w:uiPriority w:val="9"/>
     <w:semiHidden/>
-    <w:rsid w:val="004639B2"/>
+    <w:rsid w:val="00616878"/>
     <w:rPr>
       <w:rFonts w:eastAsiaTheme="majorEastAsia" w:cstheme="majorBidi"/>
       <w:color w:val="595959" w:themeColor="text1" w:themeTint="A6"/>
@@ -18805,7 +18805,7 @@
     <w:link w:val="a4"/>
     <w:uiPriority w:val="10"/>
     <w:qFormat/>
-    <w:rsid w:val="004639B2"/>
+    <w:rsid w:val="00616878"/>
     <w:pPr>
       <w:contextualSpacing/>
       <w:jc w:val="center"/>
@@ -18823,7 +18823,7 @@
     <w:basedOn w:val="a0"/>
     <w:link w:val="a3"/>
     <w:uiPriority w:val="10"/>
-    <w:rsid w:val="004639B2"/>
+    <w:rsid w:val="00616878"/>
     <w:rPr>
       <w:rFonts w:asciiTheme="majorHAnsi" w:eastAsiaTheme="majorEastAsia" w:hAnsiTheme="majorHAnsi" w:cstheme="majorBidi"/>
       <w:spacing w:val="-10"/>
@@ -18839,7 +18839,7 @@
     <w:link w:val="a6"/>
     <w:uiPriority w:val="11"/>
     <w:qFormat/>
-    <w:rsid w:val="004639B2"/>
+    <w:rsid w:val="00616878"/>
     <w:pPr>
       <w:numPr>
         <w:ilvl w:val="1"/>
@@ -18860,7 +18860,7 @@
     <w:basedOn w:val="a0"/>
     <w:link w:val="a5"/>
     <w:uiPriority w:val="11"/>
-    <w:rsid w:val="004639B2"/>
+    <w:rsid w:val="00616878"/>
     <w:rPr>
       <w:rFonts w:asciiTheme="majorHAnsi" w:eastAsiaTheme="majorEastAsia" w:hAnsiTheme="majorHAnsi" w:cstheme="majorBidi"/>
       <w:color w:val="595959" w:themeColor="text1" w:themeTint="A6"/>
@@ -18876,7 +18876,7 @@
     <w:link w:val="a8"/>
     <w:uiPriority w:val="29"/>
     <w:qFormat/>
-    <w:rsid w:val="004639B2"/>
+    <w:rsid w:val="00616878"/>
     <w:pPr>
       <w:spacing w:before="160" w:after="160"/>
       <w:jc w:val="center"/>
@@ -18892,7 +18892,7 @@
     <w:basedOn w:val="a0"/>
     <w:link w:val="a7"/>
     <w:uiPriority w:val="29"/>
-    <w:rsid w:val="004639B2"/>
+    <w:rsid w:val="00616878"/>
     <w:rPr>
       <w:i/>
       <w:iCs/>
@@ -18904,7 +18904,7 @@
     <w:basedOn w:val="a"/>
     <w:uiPriority w:val="34"/>
     <w:qFormat/>
-    <w:rsid w:val="004639B2"/>
+    <w:rsid w:val="00616878"/>
     <w:pPr>
       <w:ind w:left="720"/>
       <w:contextualSpacing/>
@@ -18915,7 +18915,7 @@
     <w:basedOn w:val="a0"/>
     <w:uiPriority w:val="21"/>
     <w:qFormat/>
-    <w:rsid w:val="004639B2"/>
+    <w:rsid w:val="00616878"/>
     <w:rPr>
       <w:i/>
       <w:iCs/>
@@ -18929,7 +18929,7 @@
     <w:link w:val="ac"/>
     <w:uiPriority w:val="30"/>
     <w:qFormat/>
-    <w:rsid w:val="004639B2"/>
+    <w:rsid w:val="00616878"/>
     <w:pPr>
       <w:pBdr>
         <w:top w:val="single" w:sz="4" w:space="10" w:color="2F5496" w:themeColor="accent1" w:themeShade="BF"/>
@@ -18950,7 +18950,7 @@
     <w:basedOn w:val="a0"/>
     <w:link w:val="ab"/>
     <w:uiPriority w:val="30"/>
-    <w:rsid w:val="004639B2"/>
+    <w:rsid w:val="00616878"/>
     <w:rPr>
       <w:i/>
       <w:iCs/>
@@ -18962,7 +18962,7 @@
     <w:basedOn w:val="a0"/>
     <w:uiPriority w:val="32"/>
     <w:qFormat/>
-    <w:rsid w:val="004639B2"/>
+    <w:rsid w:val="00616878"/>
     <w:rPr>
       <w:b/>
       <w:bCs/>
@@ -18976,7 +18976,7 @@
     <w:basedOn w:val="a0"/>
     <w:uiPriority w:val="99"/>
     <w:unhideWhenUsed/>
-    <w:rsid w:val="004639B2"/>
+    <w:rsid w:val="00616878"/>
     <w:rPr>
       <w:color w:val="0563C1" w:themeColor="hyperlink"/>
       <w:u w:val="single"/>
@@ -18988,7 +18988,7 @@
     <w:uiPriority w:val="99"/>
     <w:semiHidden/>
     <w:unhideWhenUsed/>
-    <w:rsid w:val="004639B2"/>
+    <w:rsid w:val="00616878"/>
     <w:rPr>
       <w:color w:val="605E5C"/>
       <w:shd w:val="clear" w:color="auto" w:fill="E1DFDD"/>
@@ -19000,7 +19000,7 @@
     <w:link w:val="af1"/>
     <w:uiPriority w:val="99"/>
     <w:unhideWhenUsed/>
-    <w:rsid w:val="004639B2"/>
+    <w:rsid w:val="00616878"/>
     <w:pPr>
       <w:tabs>
         <w:tab w:val="center" w:pos="4153"/>
@@ -19020,7 +19020,7 @@
     <w:basedOn w:val="a0"/>
     <w:link w:val="af0"/>
     <w:uiPriority w:val="99"/>
-    <w:rsid w:val="004639B2"/>
+    <w:rsid w:val="00616878"/>
     <w:rPr>
       <w:rFonts w:ascii="Times New Roman" w:eastAsia="宋体"/>
       <w:color w:val="1E2630"/>
@@ -19034,7 +19034,7 @@
     <w:link w:val="af3"/>
     <w:uiPriority w:val="99"/>
     <w:unhideWhenUsed/>
-    <w:rsid w:val="004639B2"/>
+    <w:rsid w:val="00616878"/>
     <w:pPr>
       <w:tabs>
         <w:tab w:val="center" w:pos="4153"/>
@@ -19054,7 +19054,7 @@
     <w:basedOn w:val="a0"/>
     <w:link w:val="af2"/>
     <w:uiPriority w:val="99"/>
-    <w:rsid w:val="004639B2"/>
+    <w:rsid w:val="00616878"/>
     <w:rPr>
       <w:rFonts w:ascii="Times New Roman" w:eastAsia="宋体"/>
       <w:color w:val="1E2630"/>
@@ -19069,7 +19069,7 @@
     <w:autoRedefine/>
     <w:uiPriority w:val="39"/>
     <w:unhideWhenUsed/>
-    <w:rsid w:val="004639B2"/>
+    <w:rsid w:val="00616878"/>
   </w:style>
   <w:style w:type="paragraph" w:styleId="TOC2">
     <w:name w:val="toc 2"/>
@@ -19078,7 +19078,7 @@
     <w:autoRedefine/>
     <w:uiPriority w:val="39"/>
     <w:unhideWhenUsed/>
-    <w:rsid w:val="004639B2"/>
+    <w:rsid w:val="00616878"/>
     <w:pPr>
       <w:ind w:leftChars="200" w:left="420"/>
     </w:pPr>

</xml_diff>

<commit_message>
Venue wording -> Fangshilou South 209; Lecture 2 v95 samples and code
</commit_message>
<xml_diff>
--- a/files/Syllabus-Big-Data-Analytics-2026.docx
+++ b/files/Syllabus-Big-Data-Analytics-2026.docx
@@ -238,7 +238,7 @@
         <w:rPr>
           <w:noProof/>
         </w:rPr>
-        <w:instrText>PAGEREF _Toc241088448 \h</w:instrText>
+        <w:instrText>PAGEREF _Toc241088972 \h</w:instrText>
       </w:r>
       <w:r>
         <w:rPr>
@@ -325,7 +325,7 @@
         <w:rPr>
           <w:noProof/>
         </w:rPr>
-        <w:instrText>PAGEREF _Toc241088449 \h</w:instrText>
+        <w:instrText>PAGEREF _Toc241088973 \h</w:instrText>
       </w:r>
       <w:r>
         <w:rPr>
@@ -412,7 +412,7 @@
         <w:rPr>
           <w:noProof/>
         </w:rPr>
-        <w:instrText>PAGEREF _Toc241088450 \h</w:instrText>
+        <w:instrText>PAGEREF _Toc241088974 \h</w:instrText>
       </w:r>
       <w:r>
         <w:rPr>
@@ -534,7 +534,7 @@
         <w:rPr>
           <w:noProof/>
         </w:rPr>
-        <w:instrText>PAGEREF _Toc241088451 \h</w:instrText>
+        <w:instrText>PAGEREF _Toc241088975 \h</w:instrText>
       </w:r>
       <w:r>
         <w:rPr>
@@ -621,7 +621,7 @@
         <w:rPr>
           <w:noProof/>
         </w:rPr>
-        <w:instrText>PAGEREF _Toc241088452 \h</w:instrText>
+        <w:instrText>PAGEREF _Toc241088976 \h</w:instrText>
       </w:r>
       <w:r>
         <w:rPr>
@@ -736,7 +736,7 @@
         <w:rPr>
           <w:noProof/>
         </w:rPr>
-        <w:instrText>PAGEREF _Toc241088453 \h</w:instrText>
+        <w:instrText>PAGEREF _Toc241088977 \h</w:instrText>
       </w:r>
       <w:r>
         <w:rPr>
@@ -830,7 +830,7 @@
         <w:rPr>
           <w:noProof/>
         </w:rPr>
-        <w:instrText>PAGEREF _Toc241088454 \h</w:instrText>
+        <w:instrText>PAGEREF _Toc241088978 \h</w:instrText>
       </w:r>
       <w:r>
         <w:rPr>
@@ -931,7 +931,7 @@
         <w:rPr>
           <w:noProof/>
         </w:rPr>
-        <w:instrText>PAGEREF _Toc241088455 \h</w:instrText>
+        <w:instrText>PAGEREF _Toc241088979 \h</w:instrText>
       </w:r>
       <w:r>
         <w:rPr>
@@ -1025,7 +1025,7 @@
         <w:rPr>
           <w:noProof/>
         </w:rPr>
-        <w:instrText>PAGEREF _Toc241088456 \h</w:instrText>
+        <w:instrText>PAGEREF _Toc241088980 \h</w:instrText>
       </w:r>
       <w:r>
         <w:rPr>
@@ -1119,7 +1119,7 @@
         <w:rPr>
           <w:noProof/>
         </w:rPr>
-        <w:instrText>PAGEREF _Toc241088457 \h</w:instrText>
+        <w:instrText>PAGEREF _Toc241088981 \h</w:instrText>
       </w:r>
       <w:r>
         <w:rPr>
@@ -1213,7 +1213,7 @@
         <w:rPr>
           <w:noProof/>
         </w:rPr>
-        <w:instrText>PAGEREF _Toc241088458 \h</w:instrText>
+        <w:instrText>PAGEREF _Toc241088982 \h</w:instrText>
       </w:r>
       <w:r>
         <w:rPr>
@@ -1307,7 +1307,7 @@
         <w:rPr>
           <w:noProof/>
         </w:rPr>
-        <w:instrText>PAGEREF _Toc241088459 \h</w:instrText>
+        <w:instrText>PAGEREF _Toc241088983 \h</w:instrText>
       </w:r>
       <w:r>
         <w:rPr>
@@ -1401,7 +1401,7 @@
         <w:rPr>
           <w:noProof/>
         </w:rPr>
-        <w:instrText>PAGEREF _Toc241088460 \h</w:instrText>
+        <w:instrText>PAGEREF _Toc241088984 \h</w:instrText>
       </w:r>
       <w:r>
         <w:rPr>
@@ -1495,7 +1495,7 @@
         <w:rPr>
           <w:noProof/>
         </w:rPr>
-        <w:instrText>PAGEREF _Toc241088461 \h</w:instrText>
+        <w:instrText>PAGEREF _Toc241088985 \h</w:instrText>
       </w:r>
       <w:r>
         <w:rPr>
@@ -1589,7 +1589,7 @@
         <w:rPr>
           <w:noProof/>
         </w:rPr>
-        <w:instrText>PAGEREF _Toc241088462 \h</w:instrText>
+        <w:instrText>PAGEREF _Toc241088986 \h</w:instrText>
       </w:r>
       <w:r>
         <w:rPr>
@@ -1683,7 +1683,7 @@
         <w:rPr>
           <w:noProof/>
         </w:rPr>
-        <w:instrText>PAGEREF _Toc241088463 \h</w:instrText>
+        <w:instrText>PAGEREF _Toc241088987 \h</w:instrText>
       </w:r>
       <w:r>
         <w:rPr>
@@ -1777,7 +1777,7 @@
         <w:rPr>
           <w:noProof/>
         </w:rPr>
-        <w:instrText>PAGEREF _Toc241088464 \h</w:instrText>
+        <w:instrText>PAGEREF _Toc241088988 \h</w:instrText>
       </w:r>
       <w:r>
         <w:rPr>
@@ -1871,7 +1871,7 @@
         <w:rPr>
           <w:noProof/>
         </w:rPr>
-        <w:instrText>PAGEREF _Toc241088465 \h</w:instrText>
+        <w:instrText>PAGEREF _Toc241088989 \h</w:instrText>
       </w:r>
       <w:r>
         <w:rPr>
@@ -1965,7 +1965,7 @@
         <w:rPr>
           <w:noProof/>
         </w:rPr>
-        <w:instrText>PAGEREF _Toc241088466 \h</w:instrText>
+        <w:instrText>PAGEREF _Toc241088990 \h</w:instrText>
       </w:r>
       <w:r>
         <w:rPr>
@@ -2059,7 +2059,7 @@
         <w:rPr>
           <w:noProof/>
         </w:rPr>
-        <w:instrText>PAGEREF _Toc241088467 \h</w:instrText>
+        <w:instrText>PAGEREF _Toc241088991 \h</w:instrText>
       </w:r>
       <w:r>
         <w:rPr>
@@ -2146,7 +2146,7 @@
         <w:rPr>
           <w:noProof/>
         </w:rPr>
-        <w:instrText>PAGEREF _Toc241088468 \h</w:instrText>
+        <w:instrText>PAGEREF _Toc241088992 \h</w:instrText>
       </w:r>
       <w:r>
         <w:rPr>
@@ -2254,7 +2254,7 @@
         <w:rPr>
           <w:noProof/>
         </w:rPr>
-        <w:instrText>PAGEREF _Toc241088469 \h</w:instrText>
+        <w:instrText>PAGEREF _Toc241088993 \h</w:instrText>
       </w:r>
       <w:r>
         <w:rPr>
@@ -2341,7 +2341,7 @@
         <w:rPr>
           <w:noProof/>
         </w:rPr>
-        <w:instrText>PAGEREF _Toc241088470 \h</w:instrText>
+        <w:instrText>PAGEREF _Toc241088994 \h</w:instrText>
       </w:r>
       <w:r>
         <w:rPr>
@@ -2442,7 +2442,7 @@
         <w:rPr>
           <w:noProof/>
         </w:rPr>
-        <w:instrText>PAGEREF _Toc241088471 \h</w:instrText>
+        <w:instrText>PAGEREF _Toc241088995 \h</w:instrText>
       </w:r>
       <w:r>
         <w:rPr>
@@ -2543,7 +2543,7 @@
         <w:rPr>
           <w:noProof/>
         </w:rPr>
-        <w:instrText>PAGEREF _Toc241088472 \h</w:instrText>
+        <w:instrText>PAGEREF _Toc241088996 \h</w:instrText>
       </w:r>
       <w:r>
         <w:rPr>
@@ -2644,7 +2644,7 @@
         <w:rPr>
           <w:noProof/>
         </w:rPr>
-        <w:instrText>PAGEREF _Toc241088473 \h</w:instrText>
+        <w:instrText>PAGEREF _Toc241088997 \h</w:instrText>
       </w:r>
       <w:r>
         <w:rPr>
@@ -2731,7 +2731,7 @@
         <w:rPr>
           <w:noProof/>
         </w:rPr>
-        <w:instrText>PAGEREF _Toc241088474 \h</w:instrText>
+        <w:instrText>PAGEREF _Toc241088998 \h</w:instrText>
       </w:r>
       <w:r>
         <w:rPr>
@@ -2819,7 +2819,7 @@
         <w:rPr>
           <w:noProof/>
         </w:rPr>
-        <w:instrText>PAGEREF _Toc241088475 \h</w:instrText>
+        <w:instrText>PAGEREF _Toc241088999 \h</w:instrText>
       </w:r>
       <w:r>
         <w:rPr>
@@ -2906,7 +2906,7 @@
         <w:rPr>
           <w:noProof/>
         </w:rPr>
-        <w:instrText>PAGEREF _Toc241088476 \h</w:instrText>
+        <w:instrText>PAGEREF _Toc241089000 \h</w:instrText>
       </w:r>
       <w:r>
         <w:rPr>
@@ -2993,7 +2993,7 @@
         <w:rPr>
           <w:noProof/>
         </w:rPr>
-        <w:instrText>PAGEREF _Toc241088477 \h</w:instrText>
+        <w:instrText>PAGEREF _Toc241089001 \h</w:instrText>
       </w:r>
       <w:r>
         <w:rPr>
@@ -3080,7 +3080,7 @@
         <w:rPr>
           <w:noProof/>
         </w:rPr>
-        <w:instrText>PAGEREF _Toc241088478 \h</w:instrText>
+        <w:instrText>PAGEREF _Toc241089002 \h</w:instrText>
       </w:r>
       <w:r>
         <w:rPr>
@@ -3167,7 +3167,7 @@
         <w:rPr>
           <w:noProof/>
         </w:rPr>
-        <w:instrText>PAGEREF _Toc241088479 \h</w:instrText>
+        <w:instrText>PAGEREF _Toc241089003 \h</w:instrText>
       </w:r>
       <w:r>
         <w:rPr>
@@ -3268,7 +3268,7 @@
         <w:rPr>
           <w:noProof/>
         </w:rPr>
-        <w:instrText>PAGEREF _Toc241088480 \h</w:instrText>
+        <w:instrText>PAGEREF _Toc241089004 \h</w:instrText>
       </w:r>
       <w:r>
         <w:rPr>
@@ -3318,7 +3318,7 @@
         </w:rPr>
         <w:fldChar w:fldCharType="end"/>
       </w:r>
-      <w:bookmarkStart w:id="0" w:name="_Toc241088448"/>
+      <w:bookmarkStart w:id="0" w:name="_Toc241088972"/>
       <w:r>
         <w:rPr>
           <w:rFonts w:hint="eastAsia"/>
@@ -4167,7 +4167,7 @@
                 <w:rFonts w:hint="eastAsia"/>
                 <w:sz w:val="19"/>
               </w:rPr>
-              <w:t>南</w:t>
+              <w:t>四方楼南</w:t>
             </w:r>
             <w:r>
               <w:rPr>
@@ -4627,7 +4627,7 @@
           <w:rFonts w:hint="eastAsia"/>
         </w:rPr>
       </w:pPr>
-      <w:bookmarkStart w:id="1" w:name="_Toc241088449"/>
+      <w:bookmarkStart w:id="1" w:name="_Toc241088973"/>
       <w:r>
         <w:rPr>
           <w:rFonts w:hint="eastAsia"/>
@@ -4802,7 +4802,7 @@
           <w:rFonts w:hint="eastAsia"/>
         </w:rPr>
       </w:pPr>
-      <w:bookmarkStart w:id="2" w:name="_Toc241088450"/>
+      <w:bookmarkStart w:id="2" w:name="_Toc241088974"/>
       <w:r>
         <w:rPr>
           <w:rFonts w:hint="eastAsia"/>
@@ -5078,7 +5078,7 @@
           <w:rFonts w:hint="eastAsia"/>
         </w:rPr>
       </w:pPr>
-      <w:bookmarkStart w:id="3" w:name="_Toc241088451"/>
+      <w:bookmarkStart w:id="3" w:name="_Toc241088975"/>
       <w:r>
         <w:rPr>
           <w:rFonts w:hint="eastAsia"/>
@@ -9336,7 +9336,7 @@
           <w:rFonts w:hint="eastAsia"/>
         </w:rPr>
       </w:pPr>
-      <w:bookmarkStart w:id="4" w:name="_Toc241088452"/>
+      <w:bookmarkStart w:id="4" w:name="_Toc241088976"/>
       <w:r>
         <w:rPr>
           <w:rFonts w:hint="eastAsia"/>
@@ -9358,7 +9358,7 @@
           <w:rFonts w:hint="eastAsia"/>
         </w:rPr>
       </w:pPr>
-      <w:bookmarkStart w:id="5" w:name="_Toc241088453"/>
+      <w:bookmarkStart w:id="5" w:name="_Toc241088977"/>
       <w:r>
         <w:rPr>
           <w:rFonts w:hint="eastAsia"/>
@@ -9708,7 +9708,7 @@
           <w:rFonts w:hint="eastAsia"/>
         </w:rPr>
       </w:pPr>
-      <w:bookmarkStart w:id="6" w:name="_Toc241088454"/>
+      <w:bookmarkStart w:id="6" w:name="_Toc241088978"/>
       <w:r>
         <w:rPr>
           <w:rFonts w:hint="eastAsia"/>
@@ -9997,7 +9997,7 @@
           <w:rFonts w:hint="eastAsia"/>
         </w:rPr>
       </w:pPr>
-      <w:bookmarkStart w:id="7" w:name="_Toc241088455"/>
+      <w:bookmarkStart w:id="7" w:name="_Toc241088979"/>
       <w:r>
         <w:rPr>
           <w:rFonts w:hint="eastAsia"/>
@@ -10256,7 +10256,7 @@
           <w:rFonts w:hint="eastAsia"/>
         </w:rPr>
       </w:pPr>
-      <w:bookmarkStart w:id="8" w:name="_Toc241088456"/>
+      <w:bookmarkStart w:id="8" w:name="_Toc241088980"/>
       <w:r>
         <w:rPr>
           <w:rFonts w:hint="eastAsia"/>
@@ -10509,7 +10509,7 @@
           <w:rFonts w:hint="eastAsia"/>
         </w:rPr>
       </w:pPr>
-      <w:bookmarkStart w:id="9" w:name="_Toc241088457"/>
+      <w:bookmarkStart w:id="9" w:name="_Toc241088981"/>
       <w:r>
         <w:rPr>
           <w:rFonts w:hint="eastAsia"/>
@@ -10726,7 +10726,7 @@
           <w:rFonts w:hint="eastAsia"/>
         </w:rPr>
       </w:pPr>
-      <w:bookmarkStart w:id="10" w:name="_Toc241088458"/>
+      <w:bookmarkStart w:id="10" w:name="_Toc241088982"/>
       <w:r>
         <w:rPr>
           <w:rFonts w:hint="eastAsia"/>
@@ -10946,7 +10946,7 @@
           <w:rFonts w:hint="eastAsia"/>
         </w:rPr>
       </w:pPr>
-      <w:bookmarkStart w:id="11" w:name="_Toc241088459"/>
+      <w:bookmarkStart w:id="11" w:name="_Toc241088983"/>
       <w:r>
         <w:rPr>
           <w:rFonts w:hint="eastAsia"/>
@@ -11260,7 +11260,7 @@
           <w:rFonts w:hint="eastAsia"/>
         </w:rPr>
       </w:pPr>
-      <w:bookmarkStart w:id="12" w:name="_Toc241088460"/>
+      <w:bookmarkStart w:id="12" w:name="_Toc241088984"/>
       <w:r>
         <w:rPr>
           <w:rFonts w:hint="eastAsia"/>
@@ -11537,7 +11537,7 @@
           <w:rFonts w:hint="eastAsia"/>
         </w:rPr>
       </w:pPr>
-      <w:bookmarkStart w:id="13" w:name="_Toc241088461"/>
+      <w:bookmarkStart w:id="13" w:name="_Toc241088985"/>
       <w:r>
         <w:rPr>
           <w:rFonts w:hint="eastAsia"/>
@@ -11802,7 +11802,7 @@
           <w:rFonts w:hint="eastAsia"/>
         </w:rPr>
       </w:pPr>
-      <w:bookmarkStart w:id="14" w:name="_Toc241088462"/>
+      <w:bookmarkStart w:id="14" w:name="_Toc241088986"/>
       <w:r>
         <w:rPr>
           <w:rFonts w:hint="eastAsia"/>
@@ -12151,7 +12151,7 @@
           <w:rFonts w:hint="eastAsia"/>
         </w:rPr>
       </w:pPr>
-      <w:bookmarkStart w:id="15" w:name="_Toc241088463"/>
+      <w:bookmarkStart w:id="15" w:name="_Toc241088987"/>
       <w:r>
         <w:rPr>
           <w:rFonts w:hint="eastAsia"/>
@@ -12512,7 +12512,7 @@
           <w:rFonts w:hint="eastAsia"/>
         </w:rPr>
       </w:pPr>
-      <w:bookmarkStart w:id="16" w:name="_Toc241088464"/>
+      <w:bookmarkStart w:id="16" w:name="_Toc241088988"/>
       <w:r>
         <w:rPr>
           <w:rFonts w:hint="eastAsia"/>
@@ -12802,7 +12802,7 @@
           <w:rFonts w:hint="eastAsia"/>
         </w:rPr>
       </w:pPr>
-      <w:bookmarkStart w:id="17" w:name="_Toc241088465"/>
+      <w:bookmarkStart w:id="17" w:name="_Toc241088989"/>
       <w:r>
         <w:rPr>
           <w:rFonts w:hint="eastAsia"/>
@@ -13127,7 +13127,7 @@
           <w:rFonts w:hint="eastAsia"/>
         </w:rPr>
       </w:pPr>
-      <w:bookmarkStart w:id="18" w:name="_Toc241088466"/>
+      <w:bookmarkStart w:id="18" w:name="_Toc241088990"/>
       <w:r>
         <w:rPr>
           <w:rFonts w:hint="eastAsia"/>
@@ -13416,7 +13416,7 @@
           <w:rFonts w:hint="eastAsia"/>
         </w:rPr>
       </w:pPr>
-      <w:bookmarkStart w:id="19" w:name="_Toc241088467"/>
+      <w:bookmarkStart w:id="19" w:name="_Toc241088991"/>
       <w:r>
         <w:rPr>
           <w:rFonts w:hint="eastAsia"/>
@@ -13693,7 +13693,7 @@
           <w:rFonts w:hint="eastAsia"/>
         </w:rPr>
       </w:pPr>
-      <w:bookmarkStart w:id="20" w:name="_Toc241088468"/>
+      <w:bookmarkStart w:id="20" w:name="_Toc241088992"/>
       <w:r>
         <w:rPr>
           <w:rFonts w:hint="eastAsia"/>
@@ -14497,7 +14497,7 @@
           <w:rFonts w:hint="eastAsia"/>
         </w:rPr>
       </w:pPr>
-      <w:bookmarkStart w:id="21" w:name="_Toc241088469"/>
+      <w:bookmarkStart w:id="21" w:name="_Toc241088993"/>
       <w:r>
         <w:rPr>
           <w:rFonts w:hint="eastAsia"/>
@@ -15124,7 +15124,7 @@
           <w:rFonts w:hint="eastAsia"/>
         </w:rPr>
       </w:pPr>
-      <w:bookmarkStart w:id="22" w:name="_Toc241088470"/>
+      <w:bookmarkStart w:id="22" w:name="_Toc241088994"/>
       <w:r>
         <w:rPr>
           <w:rFonts w:hint="eastAsia"/>
@@ -15146,7 +15146,7 @@
           <w:rFonts w:hint="eastAsia"/>
         </w:rPr>
       </w:pPr>
-      <w:bookmarkStart w:id="23" w:name="_Toc241088471"/>
+      <w:bookmarkStart w:id="23" w:name="_Toc241088995"/>
       <w:r>
         <w:rPr>
           <w:rFonts w:hint="eastAsia"/>
@@ -15207,7 +15207,7 @@
           <w:rFonts w:hint="eastAsia"/>
         </w:rPr>
       </w:pPr>
-      <w:bookmarkStart w:id="24" w:name="_Toc241088472"/>
+      <w:bookmarkStart w:id="24" w:name="_Toc241088996"/>
       <w:r>
         <w:rPr>
           <w:rFonts w:hint="eastAsia"/>
@@ -15292,7 +15292,7 @@
           <w:rFonts w:hint="eastAsia"/>
         </w:rPr>
       </w:pPr>
-      <w:bookmarkStart w:id="25" w:name="_Toc241088473"/>
+      <w:bookmarkStart w:id="25" w:name="_Toc241088997"/>
       <w:r>
         <w:rPr>
           <w:rFonts w:hint="eastAsia"/>
@@ -15398,7 +15398,7 @@
           <w:rFonts w:hint="eastAsia"/>
         </w:rPr>
       </w:pPr>
-      <w:bookmarkStart w:id="26" w:name="_Toc241088474"/>
+      <w:bookmarkStart w:id="26" w:name="_Toc241088998"/>
       <w:r>
         <w:rPr>
           <w:rFonts w:hint="eastAsia"/>
@@ -16365,7 +16365,7 @@
           <w:rFonts w:hint="eastAsia"/>
         </w:rPr>
       </w:pPr>
-      <w:bookmarkStart w:id="27" w:name="_Toc241088475"/>
+      <w:bookmarkStart w:id="27" w:name="_Toc241088999"/>
       <w:r>
         <w:rPr>
           <w:rFonts w:hint="eastAsia"/>
@@ -16387,7 +16387,7 @@
           <w:rFonts w:hint="eastAsia"/>
         </w:rPr>
       </w:pPr>
-      <w:bookmarkStart w:id="28" w:name="_Toc241088476"/>
+      <w:bookmarkStart w:id="28" w:name="_Toc241089000"/>
       <w:r>
         <w:rPr>
           <w:rFonts w:hint="eastAsia"/>
@@ -16436,7 +16436,7 @@
           <w:rFonts w:hint="eastAsia"/>
         </w:rPr>
       </w:pPr>
-      <w:bookmarkStart w:id="29" w:name="_Toc241088477"/>
+      <w:bookmarkStart w:id="29" w:name="_Toc241089001"/>
       <w:r>
         <w:rPr>
           <w:rFonts w:hint="eastAsia"/>
@@ -16813,7 +16813,7 @@
           <w:rFonts w:hint="eastAsia"/>
         </w:rPr>
       </w:pPr>
-      <w:bookmarkStart w:id="30" w:name="_Toc241088478"/>
+      <w:bookmarkStart w:id="30" w:name="_Toc241089002"/>
       <w:r>
         <w:rPr>
           <w:rFonts w:hint="eastAsia"/>
@@ -17087,7 +17087,7 @@
           <w:rFonts w:hint="eastAsia"/>
         </w:rPr>
       </w:pPr>
-      <w:bookmarkStart w:id="31" w:name="_Toc241088479"/>
+      <w:bookmarkStart w:id="31" w:name="_Toc241089003"/>
       <w:r>
         <w:rPr>
           <w:rFonts w:hint="eastAsia"/>
@@ -17439,7 +17439,7 @@
           <w:rFonts w:hint="eastAsia"/>
         </w:rPr>
       </w:pPr>
-      <w:bookmarkStart w:id="32" w:name="_Toc241088480"/>
+      <w:bookmarkStart w:id="32" w:name="_Toc241089004"/>
       <w:r>
         <w:rPr>
           <w:rFonts w:hint="eastAsia"/>
@@ -18457,7 +18457,7 @@
     <w:link w:val="10"/>
     <w:uiPriority w:val="9"/>
     <w:qFormat/>
-    <w:rsid w:val="00616878"/>
+    <w:rsid w:val="00F75A49"/>
     <w:pPr>
       <w:keepNext/>
       <w:keepLines/>
@@ -18480,7 +18480,7 @@
     <w:uiPriority w:val="9"/>
     <w:unhideWhenUsed/>
     <w:qFormat/>
-    <w:rsid w:val="00616878"/>
+    <w:rsid w:val="00F75A49"/>
     <w:pPr>
       <w:keepNext/>
       <w:keepLines/>
@@ -18503,7 +18503,7 @@
     <w:semiHidden/>
     <w:unhideWhenUsed/>
     <w:qFormat/>
-    <w:rsid w:val="00616878"/>
+    <w:rsid w:val="00F75A49"/>
     <w:pPr>
       <w:keepNext/>
       <w:keepLines/>
@@ -18526,7 +18526,7 @@
     <w:semiHidden/>
     <w:unhideWhenUsed/>
     <w:qFormat/>
-    <w:rsid w:val="00616878"/>
+    <w:rsid w:val="00F75A49"/>
     <w:pPr>
       <w:keepNext/>
       <w:keepLines/>
@@ -18549,7 +18549,7 @@
     <w:semiHidden/>
     <w:unhideWhenUsed/>
     <w:qFormat/>
-    <w:rsid w:val="00616878"/>
+    <w:rsid w:val="00F75A49"/>
     <w:pPr>
       <w:keepNext/>
       <w:keepLines/>
@@ -18572,7 +18572,7 @@
     <w:semiHidden/>
     <w:unhideWhenUsed/>
     <w:qFormat/>
-    <w:rsid w:val="00616878"/>
+    <w:rsid w:val="00F75A49"/>
     <w:pPr>
       <w:keepNext/>
       <w:keepLines/>
@@ -18595,7 +18595,7 @@
     <w:semiHidden/>
     <w:unhideWhenUsed/>
     <w:qFormat/>
-    <w:rsid w:val="00616878"/>
+    <w:rsid w:val="00F75A49"/>
     <w:pPr>
       <w:keepNext/>
       <w:keepLines/>
@@ -18618,7 +18618,7 @@
     <w:semiHidden/>
     <w:unhideWhenUsed/>
     <w:qFormat/>
-    <w:rsid w:val="00616878"/>
+    <w:rsid w:val="00F75A49"/>
     <w:pPr>
       <w:keepNext/>
       <w:keepLines/>
@@ -18638,7 +18638,7 @@
     <w:semiHidden/>
     <w:unhideWhenUsed/>
     <w:qFormat/>
-    <w:rsid w:val="00616878"/>
+    <w:rsid w:val="00F75A49"/>
     <w:pPr>
       <w:keepNext/>
       <w:keepLines/>
@@ -18681,7 +18681,7 @@
     <w:basedOn w:val="a0"/>
     <w:link w:val="1"/>
     <w:uiPriority w:val="9"/>
-    <w:rsid w:val="00616878"/>
+    <w:rsid w:val="00F75A49"/>
     <w:rPr>
       <w:rFonts w:ascii="Arial" w:eastAsia="微软雅黑" w:hAnsiTheme="majorHAnsi" w:cstheme="majorBidi"/>
       <w:b/>
@@ -18695,7 +18695,7 @@
     <w:basedOn w:val="a0"/>
     <w:link w:val="2"/>
     <w:uiPriority w:val="9"/>
-    <w:rsid w:val="00616878"/>
+    <w:rsid w:val="00F75A49"/>
     <w:rPr>
       <w:rFonts w:ascii="Arial" w:eastAsia="微软雅黑" w:hAnsiTheme="majorHAnsi" w:cstheme="majorBidi"/>
       <w:b/>
@@ -18710,7 +18710,7 @@
     <w:link w:val="3"/>
     <w:uiPriority w:val="9"/>
     <w:semiHidden/>
-    <w:rsid w:val="00616878"/>
+    <w:rsid w:val="00F75A49"/>
     <w:rPr>
       <w:rFonts w:asciiTheme="majorHAnsi" w:eastAsiaTheme="majorEastAsia" w:hAnsiTheme="majorHAnsi" w:cstheme="majorBidi"/>
       <w:color w:val="2F5496" w:themeColor="accent1" w:themeShade="BF"/>
@@ -18724,7 +18724,7 @@
     <w:link w:val="4"/>
     <w:uiPriority w:val="9"/>
     <w:semiHidden/>
-    <w:rsid w:val="00616878"/>
+    <w:rsid w:val="00F75A49"/>
     <w:rPr>
       <w:rFonts w:cstheme="majorBidi"/>
       <w:color w:val="2F5496" w:themeColor="accent1" w:themeShade="BF"/>
@@ -18738,7 +18738,7 @@
     <w:link w:val="5"/>
     <w:uiPriority w:val="9"/>
     <w:semiHidden/>
-    <w:rsid w:val="00616878"/>
+    <w:rsid w:val="00F75A49"/>
     <w:rPr>
       <w:rFonts w:cstheme="majorBidi"/>
       <w:color w:val="2F5496" w:themeColor="accent1" w:themeShade="BF"/>
@@ -18752,7 +18752,7 @@
     <w:link w:val="6"/>
     <w:uiPriority w:val="9"/>
     <w:semiHidden/>
-    <w:rsid w:val="00616878"/>
+    <w:rsid w:val="00F75A49"/>
     <w:rPr>
       <w:rFonts w:cstheme="majorBidi"/>
       <w:b/>
@@ -18766,7 +18766,7 @@
     <w:link w:val="7"/>
     <w:uiPriority w:val="9"/>
     <w:semiHidden/>
-    <w:rsid w:val="00616878"/>
+    <w:rsid w:val="00F75A49"/>
     <w:rPr>
       <w:rFonts w:cstheme="majorBidi"/>
       <w:b/>
@@ -18780,7 +18780,7 @@
     <w:link w:val="8"/>
     <w:uiPriority w:val="9"/>
     <w:semiHidden/>
-    <w:rsid w:val="00616878"/>
+    <w:rsid w:val="00F75A49"/>
     <w:rPr>
       <w:rFonts w:cstheme="majorBidi"/>
       <w:color w:val="595959" w:themeColor="text1" w:themeTint="A6"/>
@@ -18792,7 +18792,7 @@
     <w:link w:val="9"/>
     <w:uiPriority w:val="9"/>
     <w:semiHidden/>
-    <w:rsid w:val="00616878"/>
+    <w:rsid w:val="00F75A49"/>
     <w:rPr>
       <w:rFonts w:eastAsiaTheme="majorEastAsia" w:cstheme="majorBidi"/>
       <w:color w:val="595959" w:themeColor="text1" w:themeTint="A6"/>
@@ -18805,7 +18805,7 @@
     <w:link w:val="a4"/>
     <w:uiPriority w:val="10"/>
     <w:qFormat/>
-    <w:rsid w:val="00616878"/>
+    <w:rsid w:val="00F75A49"/>
     <w:pPr>
       <w:contextualSpacing/>
       <w:jc w:val="center"/>
@@ -18823,7 +18823,7 @@
     <w:basedOn w:val="a0"/>
     <w:link w:val="a3"/>
     <w:uiPriority w:val="10"/>
-    <w:rsid w:val="00616878"/>
+    <w:rsid w:val="00F75A49"/>
     <w:rPr>
       <w:rFonts w:asciiTheme="majorHAnsi" w:eastAsiaTheme="majorEastAsia" w:hAnsiTheme="majorHAnsi" w:cstheme="majorBidi"/>
       <w:spacing w:val="-10"/>
@@ -18839,7 +18839,7 @@
     <w:link w:val="a6"/>
     <w:uiPriority w:val="11"/>
     <w:qFormat/>
-    <w:rsid w:val="00616878"/>
+    <w:rsid w:val="00F75A49"/>
     <w:pPr>
       <w:numPr>
         <w:ilvl w:val="1"/>
@@ -18860,7 +18860,7 @@
     <w:basedOn w:val="a0"/>
     <w:link w:val="a5"/>
     <w:uiPriority w:val="11"/>
-    <w:rsid w:val="00616878"/>
+    <w:rsid w:val="00F75A49"/>
     <w:rPr>
       <w:rFonts w:asciiTheme="majorHAnsi" w:eastAsiaTheme="majorEastAsia" w:hAnsiTheme="majorHAnsi" w:cstheme="majorBidi"/>
       <w:color w:val="595959" w:themeColor="text1" w:themeTint="A6"/>
@@ -18876,7 +18876,7 @@
     <w:link w:val="a8"/>
     <w:uiPriority w:val="29"/>
     <w:qFormat/>
-    <w:rsid w:val="00616878"/>
+    <w:rsid w:val="00F75A49"/>
     <w:pPr>
       <w:spacing w:before="160" w:after="160"/>
       <w:jc w:val="center"/>
@@ -18892,7 +18892,7 @@
     <w:basedOn w:val="a0"/>
     <w:link w:val="a7"/>
     <w:uiPriority w:val="29"/>
-    <w:rsid w:val="00616878"/>
+    <w:rsid w:val="00F75A49"/>
     <w:rPr>
       <w:i/>
       <w:iCs/>
@@ -18904,7 +18904,7 @@
     <w:basedOn w:val="a"/>
     <w:uiPriority w:val="34"/>
     <w:qFormat/>
-    <w:rsid w:val="00616878"/>
+    <w:rsid w:val="00F75A49"/>
     <w:pPr>
       <w:ind w:left="720"/>
       <w:contextualSpacing/>
@@ -18915,7 +18915,7 @@
     <w:basedOn w:val="a0"/>
     <w:uiPriority w:val="21"/>
     <w:qFormat/>
-    <w:rsid w:val="00616878"/>
+    <w:rsid w:val="00F75A49"/>
     <w:rPr>
       <w:i/>
       <w:iCs/>
@@ -18929,7 +18929,7 @@
     <w:link w:val="ac"/>
     <w:uiPriority w:val="30"/>
     <w:qFormat/>
-    <w:rsid w:val="00616878"/>
+    <w:rsid w:val="00F75A49"/>
     <w:pPr>
       <w:pBdr>
         <w:top w:val="single" w:sz="4" w:space="10" w:color="2F5496" w:themeColor="accent1" w:themeShade="BF"/>
@@ -18950,7 +18950,7 @@
     <w:basedOn w:val="a0"/>
     <w:link w:val="ab"/>
     <w:uiPriority w:val="30"/>
-    <w:rsid w:val="00616878"/>
+    <w:rsid w:val="00F75A49"/>
     <w:rPr>
       <w:i/>
       <w:iCs/>
@@ -18962,7 +18962,7 @@
     <w:basedOn w:val="a0"/>
     <w:uiPriority w:val="32"/>
     <w:qFormat/>
-    <w:rsid w:val="00616878"/>
+    <w:rsid w:val="00F75A49"/>
     <w:rPr>
       <w:b/>
       <w:bCs/>
@@ -18976,7 +18976,7 @@
     <w:basedOn w:val="a0"/>
     <w:uiPriority w:val="99"/>
     <w:unhideWhenUsed/>
-    <w:rsid w:val="00616878"/>
+    <w:rsid w:val="00F75A49"/>
     <w:rPr>
       <w:color w:val="0563C1" w:themeColor="hyperlink"/>
       <w:u w:val="single"/>
@@ -18988,7 +18988,7 @@
     <w:uiPriority w:val="99"/>
     <w:semiHidden/>
     <w:unhideWhenUsed/>
-    <w:rsid w:val="00616878"/>
+    <w:rsid w:val="00F75A49"/>
     <w:rPr>
       <w:color w:val="605E5C"/>
       <w:shd w:val="clear" w:color="auto" w:fill="E1DFDD"/>
@@ -19000,7 +19000,7 @@
     <w:link w:val="af1"/>
     <w:uiPriority w:val="99"/>
     <w:unhideWhenUsed/>
-    <w:rsid w:val="00616878"/>
+    <w:rsid w:val="00F75A49"/>
     <w:pPr>
       <w:tabs>
         <w:tab w:val="center" w:pos="4153"/>
@@ -19020,7 +19020,7 @@
     <w:basedOn w:val="a0"/>
     <w:link w:val="af0"/>
     <w:uiPriority w:val="99"/>
-    <w:rsid w:val="00616878"/>
+    <w:rsid w:val="00F75A49"/>
     <w:rPr>
       <w:rFonts w:ascii="Times New Roman" w:eastAsia="宋体"/>
       <w:color w:val="1E2630"/>
@@ -19034,7 +19034,7 @@
     <w:link w:val="af3"/>
     <w:uiPriority w:val="99"/>
     <w:unhideWhenUsed/>
-    <w:rsid w:val="00616878"/>
+    <w:rsid w:val="00F75A49"/>
     <w:pPr>
       <w:tabs>
         <w:tab w:val="center" w:pos="4153"/>
@@ -19054,7 +19054,7 @@
     <w:basedOn w:val="a0"/>
     <w:link w:val="af2"/>
     <w:uiPriority w:val="99"/>
-    <w:rsid w:val="00616878"/>
+    <w:rsid w:val="00F75A49"/>
     <w:rPr>
       <w:rFonts w:ascii="Times New Roman" w:eastAsia="宋体"/>
       <w:color w:val="1E2630"/>
@@ -19069,7 +19069,7 @@
     <w:autoRedefine/>
     <w:uiPriority w:val="39"/>
     <w:unhideWhenUsed/>
-    <w:rsid w:val="00616878"/>
+    <w:rsid w:val="00F75A49"/>
   </w:style>
   <w:style w:type="paragraph" w:styleId="TOC2">
     <w:name w:val="toc 2"/>
@@ -19078,7 +19078,7 @@
     <w:autoRedefine/>
     <w:uiPriority w:val="39"/>
     <w:unhideWhenUsed/>
-    <w:rsid w:val="00616878"/>
+    <w:rsid w:val="00F75A49"/>
     <w:pPr>
       <w:ind w:leftChars="200" w:left="420"/>
     </w:pPr>

</xml_diff>